<commit_message>
Documento grupal corregido: Planificación Fase 1
Se sube el documento grupal corregido con la planificación de la Fase 1 para el proyecto Acreditta.
</commit_message>
<xml_diff>
--- a/1.5_GuiaEstudiante_Fase 1_Definicion Proyecto APT (Español).docx
+++ b/1.5_GuiaEstudiante_Fase 1_Definicion Proyecto APT (Español).docx
@@ -10,7 +10,7 @@
         <w:rPr>
           <w:rtl w:val="0"/>
         </w:rPr>
-        <w:t xml:space="preserve">}</w:t>
+        <w:t xml:space="preserve"> }</w:t>
       </w:r>
       <w:r>
         <mc:AlternateContent>
@@ -19,7 +19,7 @@
               <wp:anchor allowOverlap="1" behindDoc="0" distB="0" distT="0" distL="114300" distR="114300" hidden="0" layoutInCell="1" locked="0" relativeHeight="0" simplePos="0">
                 <wp:simplePos x="0" y="0"/>
                 <wp:positionH relativeFrom="column">
-                  <wp:posOffset>-435398</wp:posOffset>
+                  <wp:posOffset>-435397</wp:posOffset>
                 </wp:positionH>
                 <wp:positionV relativeFrom="paragraph">
                   <wp:posOffset>33444</wp:posOffset>
@@ -27,7 +27,7 @@
                 <wp:extent cx="6580505" cy="1486535"/>
                 <wp:effectExtent b="0" l="0" r="0" t="0"/>
                 <wp:wrapNone/>
-                <wp:docPr id="48" name=""/>
+                <wp:docPr id="50" name=""/>
                 <a:graphic>
                   <a:graphicData uri="http://schemas.microsoft.com/office/word/2010/wordprocessingGroup">
                     <wpg:wgp>
@@ -46,8 +46,8 @@
                           <a:xfrm>
                             <a:off x="2055748" y="3036733"/>
                             <a:ext cx="6580505" cy="1486535"/>
-                            <a:chOff x="0" y="0"/>
-                            <a:chExt cx="5903463" cy="1486894"/>
+                            <a:chOff x="2055725" y="3036725"/>
+                            <a:chExt cx="6580550" cy="1486550"/>
                           </a:xfrm>
                         </wpg:grpSpPr>
                         <wps:wsp>
@@ -55,8 +55,8 @@
                           <wps:cNvPr id="3" name="Shape 3"/>
                           <wps:spPr>
                             <a:xfrm>
-                              <a:off x="0" y="0"/>
-                              <a:ext cx="5903450" cy="1486875"/>
+                              <a:off x="2055725" y="3036725"/>
+                              <a:ext cx="6580550" cy="1486550"/>
                             </a:xfrm>
                             <a:prstGeom prst="rect">
                               <a:avLst/>
@@ -82,138 +82,181 @@
                             <a:noAutofit/>
                           </wps:bodyPr>
                         </wps:wsp>
-                        <wps:wsp>
-                          <wps:cNvSpPr/>
-                          <wps:cNvPr id="4" name="Shape 4"/>
-                          <wps:spPr>
+                        <wpg:grpSp>
+                          <wpg:cNvGrpSpPr/>
+                          <wpg:grpSpPr>
                             <a:xfrm>
-                              <a:off x="1024758" y="239160"/>
-                              <a:ext cx="4878705" cy="1236313"/>
+                              <a:off x="2055748" y="3036733"/>
+                              <a:ext cx="6580505" cy="1486535"/>
+                              <a:chOff x="0" y="0"/>
+                              <a:chExt cx="5903463" cy="1486894"/>
                             </a:xfrm>
-                            <a:prstGeom prst="rect">
-                              <a:avLst/>
-                            </a:prstGeom>
-                            <a:noFill/>
-                            <a:ln>
+                          </wpg:grpSpPr>
+                          <wps:wsp>
+                            <wps:cNvSpPr/>
+                            <wps:cNvPr id="5" name="Shape 5"/>
+                            <wps:spPr>
+                              <a:xfrm>
+                                <a:off x="0" y="0"/>
+                                <a:ext cx="5903450" cy="1486875"/>
+                              </a:xfrm>
+                              <a:prstGeom prst="rect">
+                                <a:avLst/>
+                              </a:prstGeom>
                               <a:noFill/>
-                            </a:ln>
-                          </wps:spPr>
-                          <wps:txbx>
-                            <w:txbxContent>
-                              <w:p>
-                                <w:pPr>
-                                  <w:spacing w:after="0" w:before="0" w:line="240"/>
-                                  <w:ind w:left="0" w:right="0" w:firstLine="0"/>
-                                  <w:jc w:val="left"/>
-                                  <w:textDirection w:val="btLr"/>
-                                </w:pPr>
-                              </w:p>
-                              <w:p>
-                                <w:pPr>
-                                  <w:spacing w:after="0" w:before="0" w:line="240"/>
-                                  <w:ind w:left="0" w:right="0" w:firstLine="0"/>
-                                  <w:jc w:val="left"/>
-                                  <w:textDirection w:val="btLr"/>
-                                </w:pPr>
-                                <w:r>
-                                  <w:rPr>
-                                    <w:rFonts w:ascii="Calibri" w:cs="Calibri" w:eastAsia="Calibri" w:hAnsi="Calibri"/>
-                                    <w:b w:val="1"/>
-                                    <w:i w:val="0"/>
-                                    <w:smallCaps w:val="0"/>
-                                    <w:strike w:val="0"/>
-                                    <w:color w:val="ff0000"/>
-                                    <w:sz w:val="48"/>
-                                    <w:vertAlign w:val="baseline"/>
-                                  </w:rPr>
-                                </w:r>
-                                <w:r>
-                                  <w:rPr>
-                                    <w:rFonts w:ascii="Calibri" w:cs="Calibri" w:eastAsia="Calibri" w:hAnsi="Calibri"/>
-                                    <w:b w:val="1"/>
-                                    <w:i w:val="0"/>
-                                    <w:smallCaps w:val="0"/>
-                                    <w:strike w:val="0"/>
-                                    <w:color w:val="1f3864"/>
-                                    <w:sz w:val="48"/>
-                                    <w:vertAlign w:val="baseline"/>
-                                  </w:rPr>
-                                  <w:t xml:space="preserve">Guía1. Definición Proyecto APT </w:t>
-                                </w:r>
-                              </w:p>
-                              <w:p>
-                                <w:pPr>
-                                  <w:spacing w:after="0" w:before="0" w:line="240"/>
-                                  <w:ind w:left="0" w:right="0" w:firstLine="0"/>
-                                  <w:jc w:val="left"/>
-                                  <w:textDirection w:val="btLr"/>
-                                </w:pPr>
-                                <w:r>
-                                  <w:rPr>
-                                    <w:rFonts w:ascii="Calibri" w:cs="Calibri" w:eastAsia="Calibri" w:hAnsi="Calibri"/>
-                                    <w:b w:val="1"/>
-                                    <w:i w:val="0"/>
-                                    <w:smallCaps w:val="0"/>
-                                    <w:strike w:val="0"/>
-                                    <w:color w:val="1f3864"/>
-                                    <w:sz w:val="48"/>
-                                    <w:vertAlign w:val="baseline"/>
-                                  </w:rPr>
-                                </w:r>
-                                <w:r>
-                                  <w:rPr>
-                                    <w:rFonts w:ascii="Calibri" w:cs="Calibri" w:eastAsia="Calibri" w:hAnsi="Calibri"/>
-                                    <w:b w:val="1"/>
-                                    <w:i w:val="0"/>
-                                    <w:smallCaps w:val="0"/>
-                                    <w:strike w:val="0"/>
-                                    <w:color w:val="1f3864"/>
-                                    <w:sz w:val="48"/>
-                                    <w:vertAlign w:val="baseline"/>
-                                  </w:rPr>
-                                  <w:t xml:space="preserve">Asignatura Capstone</w:t>
-                                </w:r>
-                              </w:p>
-                            </w:txbxContent>
-                          </wps:txbx>
-                          <wps:bodyPr anchorCtr="0" anchor="t" bIns="45700" lIns="91425" spcFirstLastPara="1" rIns="91425" wrap="square" tIns="45700">
-                            <a:noAutofit/>
-                          </wps:bodyPr>
-                        </wps:wsp>
-                        <wps:wsp>
-                          <wps:cNvSpPr/>
-                          <wps:cNvPr id="5" name="Shape 5"/>
-                          <wps:spPr>
-                            <a:xfrm>
-                              <a:off x="0" y="0"/>
-                              <a:ext cx="993140" cy="1486894"/>
-                            </a:xfrm>
-                            <a:prstGeom prst="rect">
-                              <a:avLst/>
-                            </a:prstGeom>
-                            <a:solidFill>
-                              <a:srgbClr val="1F3864"/>
-                            </a:solidFill>
-                            <a:ln>
+                              <a:ln>
+                                <a:noFill/>
+                              </a:ln>
+                            </wps:spPr>
+                            <wps:txbx>
+                              <w:txbxContent>
+                                <w:p>
+                                  <w:pPr>
+                                    <w:spacing w:after="0" w:before="0" w:line="240"/>
+                                    <w:ind w:left="0" w:right="0" w:firstLine="0"/>
+                                    <w:jc w:val="left"/>
+                                    <w:textDirection w:val="btLr"/>
+                                  </w:pPr>
+                                </w:p>
+                              </w:txbxContent>
+                            </wps:txbx>
+                            <wps:bodyPr anchorCtr="0" anchor="ctr" bIns="91425" lIns="91425" spcFirstLastPara="1" rIns="91425" wrap="square" tIns="91425">
+                              <a:noAutofit/>
+                            </wps:bodyPr>
+                          </wps:wsp>
+                          <wps:wsp>
+                            <wps:cNvSpPr/>
+                            <wps:cNvPr id="6" name="Shape 6"/>
+                            <wps:spPr>
+                              <a:xfrm>
+                                <a:off x="1024758" y="239160"/>
+                                <a:ext cx="4878705" cy="1236313"/>
+                              </a:xfrm>
+                              <a:prstGeom prst="rect">
+                                <a:avLst/>
+                              </a:prstGeom>
                               <a:noFill/>
-                            </a:ln>
-                          </wps:spPr>
-                          <wps:txbx>
-                            <w:txbxContent>
-                              <w:p>
-                                <w:pPr>
-                                  <w:spacing w:after="0" w:before="0" w:line="240"/>
-                                  <w:ind w:left="0" w:right="0" w:firstLine="0"/>
-                                  <w:jc w:val="left"/>
-                                  <w:textDirection w:val="btLr"/>
-                                </w:pPr>
-                              </w:p>
-                            </w:txbxContent>
-                          </wps:txbx>
-                          <wps:bodyPr anchorCtr="0" anchor="ctr" bIns="91425" lIns="91425" spcFirstLastPara="1" rIns="91425" wrap="square" tIns="91425">
-                            <a:noAutofit/>
-                          </wps:bodyPr>
-                        </wps:wsp>
+                              <a:ln>
+                                <a:noFill/>
+                              </a:ln>
+                            </wps:spPr>
+                            <wps:txbx>
+                              <w:txbxContent>
+                                <w:p>
+                                  <w:pPr>
+                                    <w:spacing w:after="0" w:before="0" w:line="240"/>
+                                    <w:ind w:left="0" w:right="0" w:firstLine="0"/>
+                                    <w:jc w:val="left"/>
+                                    <w:textDirection w:val="btLr"/>
+                                  </w:pPr>
+                                </w:p>
+                                <w:p>
+                                  <w:pPr>
+                                    <w:spacing w:after="0" w:before="0" w:line="240"/>
+                                    <w:ind w:left="0" w:right="0" w:firstLine="0"/>
+                                    <w:jc w:val="left"/>
+                                    <w:textDirection w:val="btLr"/>
+                                  </w:pPr>
+                                  <w:r>
+                                    <w:rPr>
+                                      <w:rFonts w:ascii="Arial" w:cs="Arial" w:eastAsia="Arial" w:hAnsi="Arial"/>
+                                      <w:b w:val="0"/>
+                                      <w:i w:val="0"/>
+                                      <w:smallCaps w:val="0"/>
+                                      <w:strike w:val="0"/>
+                                      <w:color w:val="000000"/>
+                                      <w:sz w:val="28"/>
+                                      <w:vertAlign w:val="baseline"/>
+                                    </w:rPr>
+                                  </w:r>
+                                  <w:r>
+                                    <w:rPr>
+                                      <w:rFonts w:ascii="Calibri" w:cs="Calibri" w:eastAsia="Calibri" w:hAnsi="Calibri"/>
+                                      <w:b w:val="1"/>
+                                      <w:i w:val="0"/>
+                                      <w:smallCaps w:val="0"/>
+                                      <w:strike w:val="0"/>
+                                      <w:color w:val="1f3864"/>
+                                      <w:sz w:val="48"/>
+                                      <w:vertAlign w:val="baseline"/>
+                                    </w:rPr>
+                                    <w:t xml:space="preserve">Guía1. Definición Proyecto APT </w:t>
+                                  </w:r>
+                                </w:p>
+                                <w:p>
+                                  <w:pPr>
+                                    <w:spacing w:after="0" w:before="0" w:line="240"/>
+                                    <w:ind w:left="0" w:right="0" w:firstLine="0"/>
+                                    <w:jc w:val="left"/>
+                                    <w:textDirection w:val="btLr"/>
+                                  </w:pPr>
+                                  <w:r>
+                                    <w:rPr>
+                                      <w:rFonts w:ascii="Calibri" w:cs="Calibri" w:eastAsia="Calibri" w:hAnsi="Calibri"/>
+                                      <w:b w:val="1"/>
+                                      <w:i w:val="0"/>
+                                      <w:smallCaps w:val="0"/>
+                                      <w:strike w:val="0"/>
+                                      <w:color w:val="1f3864"/>
+                                      <w:sz w:val="48"/>
+                                      <w:vertAlign w:val="baseline"/>
+                                    </w:rPr>
+                                  </w:r>
+                                  <w:r>
+                                    <w:rPr>
+                                      <w:rFonts w:ascii="Calibri" w:cs="Calibri" w:eastAsia="Calibri" w:hAnsi="Calibri"/>
+                                      <w:b w:val="1"/>
+                                      <w:i w:val="0"/>
+                                      <w:smallCaps w:val="0"/>
+                                      <w:strike w:val="0"/>
+                                      <w:color w:val="1f3864"/>
+                                      <w:sz w:val="48"/>
+                                      <w:vertAlign w:val="baseline"/>
+                                    </w:rPr>
+                                    <w:t xml:space="preserve">Asignatura Capstone</w:t>
+                                  </w:r>
+                                </w:p>
+                              </w:txbxContent>
+                            </wps:txbx>
+                            <wps:bodyPr anchorCtr="0" anchor="t" bIns="45700" lIns="91425" spcFirstLastPara="1" rIns="91425" wrap="square" tIns="45700">
+                              <a:noAutofit/>
+                            </wps:bodyPr>
+                          </wps:wsp>
+                          <wps:wsp>
+                            <wps:cNvSpPr/>
+                            <wps:cNvPr id="7" name="Shape 7"/>
+                            <wps:spPr>
+                              <a:xfrm>
+                                <a:off x="0" y="0"/>
+                                <a:ext cx="993140" cy="1486894"/>
+                              </a:xfrm>
+                              <a:prstGeom prst="rect">
+                                <a:avLst/>
+                              </a:prstGeom>
+                              <a:solidFill>
+                                <a:srgbClr val="1F3864"/>
+                              </a:solidFill>
+                              <a:ln>
+                                <a:noFill/>
+                              </a:ln>
+                            </wps:spPr>
+                            <wps:txbx>
+                              <w:txbxContent>
+                                <w:p>
+                                  <w:pPr>
+                                    <w:spacing w:after="0" w:before="0" w:line="240"/>
+                                    <w:ind w:left="0" w:right="0" w:firstLine="0"/>
+                                    <w:jc w:val="left"/>
+                                    <w:textDirection w:val="btLr"/>
+                                  </w:pPr>
+                                </w:p>
+                              </w:txbxContent>
+                            </wps:txbx>
+                            <wps:bodyPr anchorCtr="0" anchor="ctr" bIns="91425" lIns="91425" spcFirstLastPara="1" rIns="91425" wrap="square" tIns="91425">
+                              <a:noAutofit/>
+                            </wps:bodyPr>
+                          </wps:wsp>
+                        </wpg:grpSp>
                       </wpg:grpSp>
                     </wpg:wgp>
                   </a:graphicData>
@@ -226,7 +269,7 @@
               <wp:anchor allowOverlap="1" behindDoc="0" distB="0" distT="0" distL="114300" distR="114300" hidden="0" layoutInCell="1" locked="0" relativeHeight="0" simplePos="0">
                 <wp:simplePos x="0" y="0"/>
                 <wp:positionH relativeFrom="column">
-                  <wp:posOffset>-435398</wp:posOffset>
+                  <wp:posOffset>-435397</wp:posOffset>
                 </wp:positionH>
                 <wp:positionV relativeFrom="paragraph">
                   <wp:posOffset>33444</wp:posOffset>
@@ -234,7 +277,7 @@
                 <wp:extent cx="6580505" cy="1486535"/>
                 <wp:effectExtent b="0" l="0" r="0" t="0"/>
                 <wp:wrapNone/>
-                <wp:docPr id="48" name="image2.png"/>
+                <wp:docPr id="50" name="image2.png"/>
                 <a:graphic>
                   <a:graphicData uri="http://schemas.openxmlformats.org/drawingml/2006/picture">
                     <pic:pic>
@@ -340,7 +383,7 @@
         <w:widowControl w:val="1"/>
         <w:numPr>
           <w:ilvl w:val="0"/>
-          <w:numId w:val="2"/>
+          <w:numId w:val="3"/>
         </w:numPr>
         <w:pBdr>
           <w:top w:space="0" w:sz="0" w:val="nil"/>
@@ -387,6 +430,11 @@
         </w:rPr>
         <w:t xml:space="preserve">PARTE I</w:t>
       </w:r>
+      <w:r>
+        <w:rPr>
+          <w:rtl w:val="0"/>
+        </w:rPr>
+      </w:r>
     </w:p>
     <w:tbl>
       <w:tblPr>
@@ -462,7 +510,6 @@
             <w:pPr>
               <w:keepNext w:val="0"/>
               <w:keepLines w:val="0"/>
-              <w:pageBreakBefore w:val="0"/>
               <w:widowControl w:val="1"/>
               <w:pBdr>
                 <w:top w:space="0" w:sz="0" w:val="nil"/>
@@ -838,7 +885,6 @@
             <w:pPr>
               <w:keepNext w:val="0"/>
               <w:keepLines w:val="0"/>
-              <w:pageBreakBefore w:val="0"/>
               <w:widowControl w:val="1"/>
               <w:pBdr>
                 <w:top w:space="0" w:sz="0" w:val="nil"/>
@@ -975,12 +1021,13 @@
               <w:rPr>
                 <w:rtl w:val="0"/>
               </w:rPr>
-              <w:t xml:space="preserve">Acreditta administración del negocio</w:t>
-            </w:r>
-            <w:r>
-              <w:rPr>
-                <w:rtl w:val="0"/>
-              </w:rPr>
+              <w:t xml:space="preserve">Acreditta</w:t>
+            </w:r>
+            <w:r>
+              <w:rPr>
+                <w:rtl w:val="0"/>
+              </w:rPr>
+              <w:t xml:space="preserve"> administración del negocio</w:t>
             </w:r>
           </w:p>
         </w:tc>
@@ -1026,11 +1073,6 @@
               </w:rPr>
               <w:t xml:space="preserve">Desarrollo de Software y Gestión de Bases de Datos.</w:t>
             </w:r>
-            <w:r>
-              <w:rPr>
-                <w:rtl w:val="0"/>
-              </w:rPr>
-            </w:r>
           </w:p>
         </w:tc>
       </w:tr>
@@ -1086,12 +1128,7 @@
               <w:rPr>
                 <w:rtl w:val="0"/>
               </w:rPr>
-              <w:t xml:space="preserve">Programación Web, Programación de Base de Datos, Arquitectura, Integración de Plataformas, y Diseño y Gestión de Requisitos.</w:t>
-            </w:r>
-            <w:r>
-              <w:rPr>
-                <w:rtl w:val="0"/>
-              </w:rPr>
+              <w:t xml:space="preserve">Integración de Sistemas, Programación de Base de Datos, Arquitectura, Integración de Plataformas, y Diseño y Gestión de Requisitos.</w:t>
             </w:r>
           </w:p>
         </w:tc>
@@ -1207,7 +1244,6 @@
             <w:pPr>
               <w:keepNext w:val="0"/>
               <w:keepLines w:val="0"/>
-              <w:pageBreakBefore w:val="0"/>
               <w:widowControl w:val="1"/>
               <w:pBdr>
                 <w:top w:space="0" w:sz="0" w:val="nil"/>
@@ -1342,7 +1378,6 @@
             <w:pPr>
               <w:keepNext w:val="0"/>
               <w:keepLines w:val="0"/>
-              <w:pageBreakBefore w:val="0"/>
               <w:widowControl w:val="1"/>
               <w:pBdr>
                 <w:top w:space="0" w:sz="0" w:val="nil"/>
@@ -1367,7 +1402,31 @@
               <w:rPr>
                 <w:rtl w:val="0"/>
               </w:rPr>
-              <w:t xml:space="preserve">El proyecto busca solucionar la necesidad que tiene el equipo interno de Acreditta de contar con un backoffice operativo para gestionar su plataforma como empresa SaaS. Escogimos este tema porque la automatización de procesos internos es un desafío crítico y altamente demandado en el campo laboral del desarrollo de software B2B. La situación se ubica en Chile, específicamente impactando el sector minero y energético (con faenas como Los Pelambres). Esto afecta directamente al equipo de operaciones de Acreditta, y de manera indirecta, a más de 1.142 empresas contratistas proveedoras. El aporte de valor real radica en centralizar y automatizar la administración de clientes y cobros, permitiendo escalar el servicio y dar soporte al nuevo proceso de ventas outbound de la empresa.</w:t>
+              <w:t xml:space="preserve">El proyecto busca solucionar la necesidad que tiene el equipo interno de </w:t>
+            </w:r>
+            <w:r>
+              <w:rPr>
+                <w:rtl w:val="0"/>
+              </w:rPr>
+              <w:t xml:space="preserve">Acreditta</w:t>
+            </w:r>
+            <w:r>
+              <w:rPr>
+                <w:rtl w:val="0"/>
+              </w:rPr>
+              <w:t xml:space="preserve"> de contar con un backoffice operativo para gestionar su plataforma como empresa SaaS. Escogimos este tema porque la automatización de procesos internos es un desafío crítico y altamente demandado en el campo laboral del desarrollo de software B2B. La situación se ubica en Chile, específicamente impactando el sector minero y energético (con faenas como Los Pelambres). Esto afecta directamente al equipo de operaciones de </w:t>
+            </w:r>
+            <w:r>
+              <w:rPr>
+                <w:rtl w:val="0"/>
+              </w:rPr>
+              <w:t xml:space="preserve">Acreditta</w:t>
+            </w:r>
+            <w:r>
+              <w:rPr>
+                <w:rtl w:val="0"/>
+              </w:rPr>
+              <w:t xml:space="preserve">, y de manera indirecta, a más de 1.142 empresas contratistas proveedoras. El aporte de valor real radica en centralizar y automatizar la administración de clientes y cobros, permitiendo escalar el servicio y dar soporte al nuevo proceso de ventas outbound de la empresa.</w:t>
             </w:r>
             <w:r>
               <w:rPr>
@@ -1419,7 +1478,19 @@
               <w:rPr>
                 <w:rtl w:val="0"/>
               </w:rPr>
-              <w:t xml:space="preserve">Se espera lograr la construcción completa de la capa de administración del negocio (backoffice) de Acreditta. Para abordar esta problemática, el proyecto consistirá en desarrollar dos pilares fundamentales: 1) Un módulo de administración (rol admin) para gestionar la aprobación o rechazo de empresas, catálogos globales, métricas e impersonación auditada. 2) Un módulo de suscripciones y pagos, el cual </w:t>
+              <w:t xml:space="preserve">Se espera lograr la construcción de la API REST y la arquitectura de base de datos para la consola interna de administración del negocio de </w:t>
+            </w:r>
+            <w:r>
+              <w:rPr>
+                <w:rtl w:val="0"/>
+              </w:rPr>
+              <w:t xml:space="preserve">Acreditta</w:t>
+            </w:r>
+            <w:r>
+              <w:rPr>
+                <w:rtl w:val="0"/>
+              </w:rPr>
+              <w:t xml:space="preserve">. Para abordar esta problemática, el proyecto consistirá en desarrollar dos pilares fundamentales: 1) Un módulo de administración (rol admin) para gestionar la aprobación o rechazo de empresas, catálogos globales, métricas e impersonación auditada. 2) Un módulo de suscripciones y pagos, el cual </w:t>
             </w:r>
             <w:r>
               <w:rPr>
@@ -1484,7 +1555,7 @@
               <w:rPr>
                 <w:rtl w:val="0"/>
               </w:rPr>
-              <w:t xml:space="preserve">El proyecto se relaciona directamente con el perfil de egreso ya que exige abarcar el ciclo completo de desarrollo de una solución de software empresarial. Para resolver la problemática son estrictamente necesarias las competencias: Programación Web y Arquitectura se aplican al construir una API con </w:t>
+              <w:t xml:space="preserve">El proyecto se relaciona directamente con el perfil de egreso ya que exige abarcar el ciclo completo de desarrollo de una solución de software empresarial. Para resolver la problemática son estrictamente necesarias las competencias: Arquitectura e Integración de Sistemas se aplican al construir una API con </w:t>
             </w:r>
             <w:r>
               <w:rPr>
@@ -1496,7 +1567,7 @@
               <w:rPr>
                 <w:rtl w:val="0"/>
               </w:rPr>
-              <w:t xml:space="preserve"> y un frontend con React/Next.js; la Programación de Base de Datos es vital para implementar el modelo ORM en PostgreSQL; y la Integración de Plataformas se demuestra al conectar webhooks de pasarelas de pago y empaquetar la solución mediante dockerización.</w:t>
+              <w:t xml:space="preserve"> y la implementación de procesos en segundo plano utilizando Celery y Redis; la Programación de Base de Datos es vital para implementar el modelo ORM en PostgreSQL; y la Integración de Plataformas se demuestra al conectar webhooks de pasarelas de pago y empaquetar la solución mediante dockerización y desplegar los servicios de la API en Vercel.</w:t>
             </w:r>
             <w:r>
               <w:rPr>
@@ -1549,7 +1620,7 @@
               <w:rPr>
                 <w:rtl w:val="0"/>
               </w:rPr>
-              <w:t xml:space="preserve">Como equipo, tenemos un fuerte interés práctico en el desarrollo de software integral, con especial enfoque en la programación backend y la gestión avanzada de bases de datos relacionales. Este proyecto refleja esos intereses al permitirnos trabajar directamente en la construcción de modelos ORM, estructuración de consultas SQL, creación de rutas (endpoints) y el manejo de arquitecturas modernas. Realizar este proyecto contribuirá a nuestro desarrollo profesional consolidando nuestras habilidades en tecnologías de alta demanda (Python, PostgreSQL, React) y preparándonos para enfrentar entornos reales de producción y despliegue.</w:t>
+              <w:t xml:space="preserve">Como equipo, tenemos un fuerte interés práctico en el desarrollo de software integral, con especial enfoque en la programación backend y la gestión avanzada de bases de datos relacionales. Este proyecto refleja esos intereses al permitirnos trabajar directamente en la construcción de modelos ORM, estructuración de consultas SQL, creación de rutas (endpoints) y el manejo de arquitecturas modernas. Realizar este proyecto contribuirá a nuestro desarrollo profesional consolidando nuestras habilidades en tecnologías de alta demanda (Python, PostgreSQL, Redis) y preparándonos para enfrentar entornos reales de producción y despliegue.</w:t>
             </w:r>
             <w:r>
               <w:rPr>
@@ -1594,7 +1665,6 @@
             <w:pPr>
               <w:keepNext w:val="0"/>
               <w:keepLines w:val="0"/>
-              <w:pageBreakBefore w:val="0"/>
               <w:widowControl w:val="1"/>
               <w:pBdr>
                 <w:top w:space="0" w:sz="0" w:val="nil"/>
@@ -1613,12 +1683,7 @@
               <w:rPr>
                 <w:rtl w:val="0"/>
               </w:rPr>
-              <w:t xml:space="preserve">Es factible desarrollar el proyecto durante las horas y duración del semestre utilizando una metodología ágil (Scrum) y dividiendo las tareas por roles. Como materiales requerimos equipos de cómputo, entornos locales de desarrollo, control de versiones en GitHub y la plataforma Vercel. Un factor externo que facilita enormemente el desarrollo es contar con documentación técnica detallada, wireframes funcionales y un modelo de datos SQL base ya definido por el cliente. Un factor que podría dificultar el trabajo es la complejidad de integrar el webhook de pagos y cumplir estrictamente con los acuerdos de confidencialidad; esto lo solucionaremos utilizando los entornos de prueba de los proveedores y aplicando pruebas unitarias rigurosas antes de realizar cualquier despliegue a producción.</w:t>
-            </w:r>
-            <w:r>
-              <w:rPr>
-                <w:rtl w:val="0"/>
-              </w:rPr>
+              <w:t xml:space="preserve">Es factible desarrollar el proyecto durante las horas y duración del semestre utilizando una metodología ágil (Scrum) y dividiendo las tareas por roles. Como materiales requerimos equipos de cómputo, entornos locales de desarrollo y control de versiones en GitHub. Un factor externo que facilita enormemente el desarrollo es contar con documentación técnica detallada y un modelo de datos SQL base ya definido por el cliente. Un factor que podría dificultar el trabajo es la complejidad de integrar el webhook de pagos y cumplir estrictamente con los acuerdos de confidencialidad; esto lo solucionaremos utilizando los entornos de prueba de los proveedores y aplicando pruebas unitarias rigurosas antes de realizar cualquier despliegue a producción.</w:t>
             </w:r>
           </w:p>
         </w:tc>
@@ -1648,7 +1713,7 @@
         <w:widowControl w:val="1"/>
         <w:numPr>
           <w:ilvl w:val="0"/>
-          <w:numId w:val="2"/>
+          <w:numId w:val="3"/>
         </w:numPr>
         <w:pBdr>
           <w:top w:space="0" w:sz="0" w:val="nil"/>
@@ -1695,6 +1760,11 @@
         </w:rPr>
         <w:t xml:space="preserve">PARTE II </w:t>
       </w:r>
+      <w:r>
+        <w:rPr>
+          <w:rtl w:val="0"/>
+        </w:rPr>
+      </w:r>
     </w:p>
     <w:tbl>
       <w:tblPr>
@@ -1770,7 +1840,6 @@
             <w:pPr>
               <w:keepNext w:val="0"/>
               <w:keepLines w:val="0"/>
-              <w:pageBreakBefore w:val="0"/>
               <w:widowControl w:val="1"/>
               <w:pBdr>
                 <w:top w:space="0" w:sz="0" w:val="nil"/>
@@ -1916,7 +1985,23 @@
                 <w:szCs w:val="20"/>
                 <w:rtl w:val="0"/>
               </w:rPr>
-              <w:t xml:space="preserve">Construir la capa de administración del negocio (backoffice) de la plataforma SaaS Acreditta, implementando la gestión operativa de empresas, el control de catálogos globales y el sistema automatizado de suscripciones y pagos.</w:t>
+              <w:t xml:space="preserve">Construir la API REST, la arquitectura de base de datos y los procesos asíncronos para la capa de administración del negocio (backoffice) de la plataforma SaaS </w:t>
+            </w:r>
+            <w:r>
+              <w:rPr>
+                <w:sz w:val="20"/>
+                <w:szCs w:val="20"/>
+                <w:rtl w:val="0"/>
+              </w:rPr>
+              <w:t xml:space="preserve">Acreditta</w:t>
+            </w:r>
+            <w:r>
+              <w:rPr>
+                <w:sz w:val="20"/>
+                <w:szCs w:val="20"/>
+                <w:rtl w:val="0"/>
+              </w:rPr>
+              <w:t xml:space="preserve">, implementando la gestión operativa de empresas, el control de catálogos globales y el sistema automatizado de suscripciones y pagos.</w:t>
             </w:r>
             <w:r>
               <w:rPr>
@@ -1961,7 +2046,7 @@
             <w:pPr>
               <w:numPr>
                 <w:ilvl w:val="0"/>
-                <w:numId w:val="3"/>
+                <w:numId w:val="2"/>
               </w:numPr>
               <w:spacing w:after="0" w:afterAutospacing="0"/>
               <w:ind w:left="720" w:hanging="360"/>
@@ -1981,7 +2066,7 @@
             <w:pPr>
               <w:numPr>
                 <w:ilvl w:val="0"/>
-                <w:numId w:val="3"/>
+                <w:numId w:val="2"/>
               </w:numPr>
               <w:spacing w:after="0" w:afterAutospacing="0"/>
               <w:ind w:left="720" w:hanging="360"/>
@@ -2001,7 +2086,7 @@
             <w:pPr>
               <w:numPr>
                 <w:ilvl w:val="0"/>
-                <w:numId w:val="3"/>
+                <w:numId w:val="2"/>
               </w:numPr>
               <w:spacing w:after="0" w:afterAutospacing="0"/>
               <w:ind w:left="720" w:hanging="360"/>
@@ -2021,7 +2106,7 @@
             <w:pPr>
               <w:numPr>
                 <w:ilvl w:val="0"/>
-                <w:numId w:val="3"/>
+                <w:numId w:val="2"/>
               </w:numPr>
               <w:spacing w:after="0" w:afterAutospacing="0"/>
               <w:ind w:left="720" w:hanging="360"/>
@@ -2034,14 +2119,14 @@
               <w:rPr>
                 <w:rtl w:val="0"/>
               </w:rPr>
-              <w:t xml:space="preserve">Construir y desplegar el prototipo y la interfaz gráfica final del backoffice utilizando React/Next.js en la plataforma Vercel.</w:t>
+              <w:t xml:space="preserve">Implementar procesos en segundo plano utilizando Celery y Redis para la recolección de métricas financieras y el monitoreo de disponibilidad del sistema.</w:t>
             </w:r>
           </w:p>
           <w:p>
             <w:pPr>
               <w:numPr>
                 <w:ilvl w:val="0"/>
-                <w:numId w:val="3"/>
+                <w:numId w:val="2"/>
               </w:numPr>
               <w:ind w:left="720" w:hanging="360"/>
               <w:jc w:val="both"/>
@@ -2053,7 +2138,7 @@
               <w:rPr>
                 <w:rtl w:val="0"/>
               </w:rPr>
-              <w:t xml:space="preserve">Configurar la dockerización del sistema y ejecutar pruebas unitarias para asegurar un despliegue estable en producción.</w:t>
+              <w:t xml:space="preserve">Configurar la dockerización del sistema y desplegar la API en Vercel, ejecutando pruebas unitarias para asegurar un entorno estable en producción.</w:t>
             </w:r>
           </w:p>
           <w:p>
@@ -2300,7 +2385,6 @@
             <w:pPr>
               <w:keepNext w:val="0"/>
               <w:keepLines w:val="0"/>
-              <w:pageBreakBefore w:val="0"/>
               <w:widowControl w:val="1"/>
               <w:pBdr>
                 <w:top w:space="0" w:sz="0" w:val="nil"/>
@@ -2441,7 +2525,7 @@
               <w:rPr>
                 <w:rtl w:val="0"/>
               </w:rPr>
-              <w:t xml:space="preserve">Para abordar la problemática y cumplir con los objetivos trazados, el equipo utilizará la Metodología Ágil Scrum con un enfoque iterativo e incremental. El método de trabajo se basará en ciclos cortos de desarrollo (sprints), cuyo seguimiento se realizará mediante reuniones semanales enfocadas exclusivamente en la revisión de los avances y la resolución de dudas técnicas o de negocio. El control de versiones del código se gestionará a través de GitHub, y las funcionalidades de la interfaz se mostrarán mediante despliegues continuos en Vercel.</w:t>
+              <w:t xml:space="preserve">Para abordar la problemática y cumplir con los objetivos trazados, el equipo utilizará la Metodología Ágil Scrum con un enfoque iterativo e incremental. El método de trabajo se basará en ciclos cortos de desarrollo (sprints), cuyo seguimiento se realizará mediante reuniones semanales enfocadas exclusivamente en la revisión de los avances y la resolución de dudas técnicas o de negocio. El control de versiones del código se gestionará a través de GitHub.</w:t>
             </w:r>
           </w:p>
           <w:p>
@@ -2453,7 +2537,7 @@
               <w:rPr>
                 <w:rtl w:val="0"/>
               </w:rPr>
-              <w:t xml:space="preserve">Dado que es un proyecto grupal, el equipo se ha organizado definiendo las siguientes funciones, tareas y responsabilidades para cada integrante:</w:t>
+              <w:t xml:space="preserve">El equipo se ha organizado definiendo las siguientes funciones, tareas y responsabilidades para cada integrante:</w:t>
             </w:r>
           </w:p>
           <w:p>
@@ -2493,7 +2577,7 @@
               <w:rPr>
                 <w:rtl w:val="0"/>
               </w:rPr>
-              <w:t xml:space="preserve">Antonia Valencia (Desarrolladora Frontend): Su responsabilidad será la construcción visual y funcional de la capa de administración. Sus tareas incluyen traducir los wireframes funcionales en interfaces interactivas utilizando React/Next.js, consumir los servicios de la API (endpoints) y encargarse del despliegue de los prototipos en la plataforma Vercel.</w:t>
+              <w:t xml:space="preserve">Antonia Valencia (Desarrolladora Backend y QA): Su responsabilidad será la implementación de los procesos asíncronos y el aseguramiento de calidad. Sus tareas incluyen programar los workers de Celery/Redis para las métricas, crear los tests automatizados (pytest) y documentar los endpoints probándolos en Postman.</w:t>
             </w:r>
           </w:p>
           <w:p>
@@ -2512,24 +2596,7 @@
               <w:rPr>
                 <w:rtl w:val="0"/>
               </w:rPr>
-              <w:t xml:space="preserve">Paula Molina (Desarrolladora Backend y QA): Estará a cargo de la lógica de negocio del lado del servidor y el aseguramiento de la calidad. Sus tareas consistirán en programar los endpoints en Python (</w:t>
-            </w:r>
-            <w:r>
-              <w:rPr>
-                <w:rtl w:val="0"/>
-              </w:rPr>
-              <w:t xml:space="preserve">FastAPI</w:t>
-            </w:r>
-            <w:r>
-              <w:rPr>
-                <w:rtl w:val="0"/>
-              </w:rPr>
-              <w:t xml:space="preserve">), integrar el webhook de la pasarela de pagos para la conciliación de facturas, y ejecutar las pruebas unitarias para validar que el sistema funcione correctamente antes de la dockerización.</w:t>
-            </w:r>
-            <w:r>
-              <w:rPr>
-                <w:rtl w:val="0"/>
-              </w:rPr>
+              <w:t xml:space="preserve">Paula Molina (Desarrolladora Backend - API REST): Estará a cargo de la lógica de negocio del lado del servidor. Sus tareas consistirán en programar los endpoints en Python (FastAPI), integrar el webhook de la pasarela de pagos para la conciliación de facturas y asegurar la correcta conexión con la base de datos.</w:t>
             </w:r>
           </w:p>
         </w:tc>
@@ -2736,7 +2803,6 @@
             <w:pPr>
               <w:keepNext w:val="0"/>
               <w:keepLines w:val="0"/>
-              <w:pageBreakBefore w:val="0"/>
               <w:widowControl w:val="1"/>
               <w:pBdr>
                 <w:top w:space="0" w:sz="0" w:val="nil"/>
@@ -2793,7 +2859,6 @@
             <w:pPr>
               <w:keepNext w:val="0"/>
               <w:keepLines w:val="0"/>
-              <w:pageBreakBefore w:val="0"/>
               <w:widowControl w:val="1"/>
               <w:pBdr>
                 <w:top w:space="0" w:sz="0" w:val="nil"/>
@@ -2855,7 +2920,6 @@
             <w:pPr>
               <w:keepNext w:val="0"/>
               <w:keepLines w:val="0"/>
-              <w:pageBreakBefore w:val="0"/>
               <w:widowControl w:val="1"/>
               <w:pBdr>
                 <w:top w:space="0" w:sz="0" w:val="nil"/>
@@ -2917,7 +2981,6 @@
             <w:pPr>
               <w:keepNext w:val="0"/>
               <w:keepLines w:val="0"/>
-              <w:pageBreakBefore w:val="0"/>
               <w:widowControl w:val="1"/>
               <w:pBdr>
                 <w:top w:space="0" w:sz="0" w:val="nil"/>
@@ -2979,7 +3042,6 @@
             <w:pPr>
               <w:keepNext w:val="0"/>
               <w:keepLines w:val="0"/>
-              <w:pageBreakBefore w:val="0"/>
               <w:widowControl w:val="1"/>
               <w:pBdr>
                 <w:top w:space="0" w:sz="0" w:val="nil"/>
@@ -3046,7 +3108,6 @@
             <w:pPr>
               <w:keepNext w:val="0"/>
               <w:keepLines w:val="0"/>
-              <w:pageBreakBefore w:val="0"/>
               <w:widowControl w:val="1"/>
               <w:pBdr>
                 <w:top w:space="0" w:sz="0" w:val="nil"/>
@@ -3101,7 +3162,6 @@
             <w:pPr>
               <w:keepNext w:val="0"/>
               <w:keepLines w:val="0"/>
-              <w:pageBreakBefore w:val="0"/>
               <w:widowControl w:val="1"/>
               <w:pBdr>
                 <w:top w:space="0" w:sz="0" w:val="nil"/>
@@ -3168,11 +3228,6 @@
               </w:rPr>
               <w:t xml:space="preserve">Creación del repositorio en GitHub con la estructura base, modelos ORM definidos y firma de acuerdos.</w:t>
             </w:r>
-            <w:r>
-              <w:rPr>
-                <w:rtl w:val="0"/>
-              </w:rPr>
-            </w:r>
           </w:p>
         </w:tc>
         <w:tc>
@@ -3181,7 +3236,6 @@
             <w:pPr>
               <w:keepNext w:val="0"/>
               <w:keepLines w:val="0"/>
-              <w:pageBreakBefore w:val="0"/>
               <w:widowControl w:val="1"/>
               <w:pBdr>
                 <w:top w:space="0" w:sz="0" w:val="nil"/>
@@ -3284,7 +3338,6 @@
             <w:pPr>
               <w:keepNext w:val="0"/>
               <w:keepLines w:val="0"/>
-              <w:pageBreakBefore w:val="0"/>
               <w:widowControl w:val="1"/>
               <w:pBdr>
                 <w:top w:space="0" w:sz="0" w:val="nil"/>
@@ -3323,7 +3376,7 @@
                 <w:color w:val="1f3864"/>
                 <w:rtl w:val="0"/>
               </w:rPr>
-              <w:t xml:space="preserve">Prototipo de interfaz en Vercel</w:t>
+              <w:t xml:space="preserve">Colección de Pruebas de API y Procesos Asíncronos</w:t>
             </w:r>
             <w:r>
               <w:rPr>
@@ -3338,7 +3391,6 @@
             <w:pPr>
               <w:keepNext w:val="0"/>
               <w:keepLines w:val="0"/>
-              <w:pageBreakBefore w:val="0"/>
               <w:widowControl w:val="1"/>
               <w:pBdr>
                 <w:top w:space="0" w:sz="0" w:val="nil"/>
@@ -3377,7 +3429,7 @@
                 <w:color w:val="1f3864"/>
                 <w:rtl w:val="0"/>
               </w:rPr>
-              <w:t xml:space="preserve">Despliegue de las pantallas principales del backoffice (React/Next.js) en la plataforma Vercel.</w:t>
+              <w:t xml:space="preserve">Implementación inicial de los endpoints en FastAPI y configuración base de los workers en Celery, verificados mediante Postman.</w:t>
             </w:r>
             <w:r>
               <w:rPr>
@@ -3392,7 +3444,6 @@
             <w:pPr>
               <w:keepNext w:val="0"/>
               <w:keepLines w:val="0"/>
-              <w:pageBreakBefore w:val="0"/>
               <w:widowControl w:val="1"/>
               <w:pBdr>
                 <w:top w:space="0" w:sz="0" w:val="nil"/>
@@ -3431,7 +3482,7 @@
                 <w:color w:val="1f3864"/>
                 <w:rtl w:val="0"/>
               </w:rPr>
-              <w:t xml:space="preserve">Visibiliza tempranamente el flujo de usuario y permite la validación visual de las funcionalidades antes de conectar el backend.</w:t>
+              <w:t xml:space="preserve">Permite validar que la lógica del servidor responde correctamente a las peticiones y procesos de fondo antes de su empaquetado final.</w:t>
             </w:r>
             <w:r>
               <w:rPr>
@@ -3495,7 +3546,6 @@
             <w:pPr>
               <w:keepNext w:val="0"/>
               <w:keepLines w:val="0"/>
-              <w:pageBreakBefore w:val="0"/>
               <w:widowControl w:val="1"/>
               <w:pBdr>
                 <w:top w:space="0" w:sz="0" w:val="nil"/>
@@ -3549,7 +3599,6 @@
             <w:pPr>
               <w:keepNext w:val="0"/>
               <w:keepLines w:val="0"/>
-              <w:pageBreakBefore w:val="0"/>
               <w:widowControl w:val="1"/>
               <w:pBdr>
                 <w:top w:space="0" w:sz="0" w:val="nil"/>
@@ -3603,7 +3652,6 @@
             <w:pPr>
               <w:keepNext w:val="0"/>
               <w:keepLines w:val="0"/>
-              <w:pageBreakBefore w:val="0"/>
               <w:widowControl w:val="1"/>
               <w:pBdr>
                 <w:top w:space="0" w:sz="0" w:val="nil"/>
@@ -3642,7 +3690,7 @@
                 <w:color w:val="1f3864"/>
                 <w:rtl w:val="0"/>
               </w:rPr>
-              <w:t xml:space="preserve">Garantiza que la lógica de negocio funcione correctamente a nivel backend antes de su integración final con el frontend.</w:t>
+              <w:t xml:space="preserve">Garantiza que la lógica de negocio funcione correctamente a nivel backend antes de ser consumida por las aplicaciones cliente o su paso a producción</w:t>
             </w:r>
             <w:r>
               <w:rPr>
@@ -3706,7 +3754,6 @@
             <w:pPr>
               <w:keepNext w:val="0"/>
               <w:keepLines w:val="0"/>
-              <w:pageBreakBefore w:val="0"/>
               <w:widowControl w:val="1"/>
               <w:pBdr>
                 <w:top w:space="0" w:sz="0" w:val="nil"/>
@@ -3745,7 +3792,7 @@
                 <w:color w:val="1f3864"/>
                 <w:rtl w:val="0"/>
               </w:rPr>
-              <w:t xml:space="preserve">Plataforma Backoffice Dockerizada</w:t>
+              <w:t xml:space="preserve">Plataforma Backoffice Desplegada</w:t>
             </w:r>
             <w:r>
               <w:rPr>
@@ -3760,7 +3807,6 @@
             <w:pPr>
               <w:keepNext w:val="0"/>
               <w:keepLines w:val="0"/>
-              <w:pageBreakBefore w:val="0"/>
               <w:widowControl w:val="1"/>
               <w:pBdr>
                 <w:top w:space="0" w:sz="0" w:val="nil"/>
@@ -3799,25 +3845,7 @@
                 <w:color w:val="1f3864"/>
                 <w:rtl w:val="0"/>
               </w:rPr>
-              <w:t xml:space="preserve">Aplicación completa (backend FastAPI/</w:t>
-            </w:r>
-            <w:r>
-              <w:rPr>
-                <w:b w:val="1"/>
-                <w:bCs w:val="1"/>
-                <w:color w:val="1f3864"/>
-                <w:rtl w:val="0"/>
-              </w:rPr>
-              <w:t xml:space="preserve">PostgreSQL</w:t>
-            </w:r>
-            <w:r>
-              <w:rPr>
-                <w:b w:val="1"/>
-                <w:bCs w:val="1"/>
-                <w:color w:val="1f3864"/>
-                <w:rtl w:val="0"/>
-              </w:rPr>
-              <w:t xml:space="preserve"> y frontend) empaquetada en contenedores.</w:t>
+              <w:t xml:space="preserve">Aplicación backend completa (API FastAPI, PostgreSQL y Celery) empaquetada en contenedores.</w:t>
             </w:r>
             <w:r>
               <w:rPr>
@@ -3832,7 +3860,6 @@
             <w:pPr>
               <w:keepNext w:val="0"/>
               <w:keepLines w:val="0"/>
-              <w:pageBreakBefore w:val="0"/>
               <w:widowControl w:val="1"/>
               <w:pBdr>
                 <w:top w:space="0" w:sz="0" w:val="nil"/>
@@ -3871,7 +3898,7 @@
                 <w:color w:val="1f3864"/>
                 <w:rtl w:val="0"/>
               </w:rPr>
-              <w:t xml:space="preserve">Es la entrega final que cumple con los requerimientos técnicos de escalabilidad y despliegue solicitados para pasar a producción.</w:t>
+              <w:t xml:space="preserve">Aplicación backend completa (API FastAPI, PostgreSQL y Celery) empaquetada en contenedores y desplegada en producción utilizando Vercel.</w:t>
             </w:r>
             <w:r>
               <w:rPr>
@@ -4160,7 +4187,6 @@
             <w:pPr>
               <w:keepNext w:val="0"/>
               <w:keepLines w:val="0"/>
-              <w:pageBreakBefore w:val="0"/>
               <w:widowControl w:val="1"/>
               <w:pBdr>
                 <w:top w:space="0" w:sz="0" w:val="nil"/>
@@ -4502,29 +4528,18 @@
           <w:tcPr/>
           <w:p>
             <w:pPr>
-              <w:jc w:val="both"/>
-              <w:rPr>
-                <w:rFonts w:ascii="Calibri" w:cs="Calibri" w:eastAsia="Calibri" w:hAnsi="Calibri"/>
-                <w:i w:val="1"/>
-                <w:iCs w:val="1"/>
+              <w:rPr>
                 <w:sz w:val="20"/>
                 <w:szCs w:val="20"/>
               </w:rPr>
             </w:pPr>
             <w:r>
               <w:rPr>
-                <w:i w:val="1"/>
-                <w:iCs w:val="1"/>
                 <w:sz w:val="20"/>
                 <w:szCs w:val="20"/>
                 <w:rtl w:val="0"/>
               </w:rPr>
               <w:t xml:space="preserve">Diseño y Gestión de Requisitos</w:t>
-            </w:r>
-            <w:r>
-              <w:rPr>
-                <w:rtl w:val="0"/>
-              </w:rPr>
             </w:r>
           </w:p>
         </w:tc>
@@ -4691,18 +4706,13 @@
           <w:tcPr/>
           <w:p>
             <w:pPr>
-              <w:jc w:val="both"/>
-              <w:rPr>
-                <w:i w:val="1"/>
-                <w:iCs w:val="1"/>
+              <w:rPr>
                 <w:sz w:val="20"/>
                 <w:szCs w:val="20"/>
               </w:rPr>
             </w:pPr>
             <w:r>
               <w:rPr>
-                <w:i w:val="1"/>
-                <w:iCs w:val="1"/>
                 <w:sz w:val="20"/>
                 <w:szCs w:val="20"/>
                 <w:rtl w:val="0"/>
@@ -4837,135 +4847,108 @@
           <w:tcPr/>
           <w:p>
             <w:pPr>
-              <w:jc w:val="both"/>
-              <w:rPr>
-                <w:rFonts w:ascii="Calibri" w:cs="Calibri" w:eastAsia="Calibri" w:hAnsi="Calibri"/>
-                <w:i w:val="1"/>
-                <w:iCs w:val="1"/>
+              <w:rPr>
                 <w:sz w:val="20"/>
                 <w:szCs w:val="20"/>
               </w:rPr>
             </w:pPr>
             <w:r>
               <w:rPr>
-                <w:i w:val="1"/>
-                <w:iCs w:val="1"/>
                 <w:sz w:val="20"/>
                 <w:szCs w:val="20"/>
                 <w:rtl w:val="0"/>
               </w:rPr>
-              <w:t xml:space="preserve">Programación Web</w:t>
-            </w:r>
-            <w:r>
-              <w:rPr>
-                <w:rtl w:val="0"/>
-              </w:rPr>
-            </w:r>
-          </w:p>
-        </w:tc>
-        <w:tc>
-          <w:tcPr/>
-          <w:p>
-            <w:pPr>
-              <w:rPr>
-                <w:rFonts w:ascii="Calibri" w:cs="Calibri" w:eastAsia="Calibri" w:hAnsi="Calibri"/>
-                <w:i w:val="1"/>
-                <w:iCs w:val="1"/>
-                <w:sz w:val="16"/>
-                <w:szCs w:val="16"/>
-              </w:rPr>
-            </w:pPr>
-            <w:r>
-              <w:rPr>
-                <w:i w:val="1"/>
-                <w:iCs w:val="1"/>
-                <w:sz w:val="16"/>
-                <w:szCs w:val="16"/>
-                <w:rtl w:val="0"/>
-              </w:rPr>
-              <w:t xml:space="preserve">Desarrollo Frontend y Prototipado</w:t>
-            </w:r>
-            <w:r>
-              <w:rPr>
-                <w:rtl w:val="0"/>
-              </w:rPr>
-            </w:r>
-          </w:p>
-        </w:tc>
-        <w:tc>
-          <w:tcPr/>
-          <w:p>
-            <w:pPr>
-              <w:rPr>
-                <w:rFonts w:ascii="Calibri" w:cs="Calibri" w:eastAsia="Calibri" w:hAnsi="Calibri"/>
-                <w:i w:val="1"/>
-                <w:iCs w:val="1"/>
-                <w:sz w:val="16"/>
-                <w:szCs w:val="16"/>
-              </w:rPr>
-            </w:pPr>
-            <w:r>
-              <w:rPr>
-                <w:i w:val="1"/>
-                <w:iCs w:val="1"/>
-                <w:sz w:val="16"/>
-                <w:szCs w:val="16"/>
-                <w:rtl w:val="0"/>
-              </w:rPr>
-              <w:t xml:space="preserve">Construcción iterativa de la interfaz en React/Next.js y despliegues continuos en Vercel.</w:t>
-            </w:r>
-            <w:r>
-              <w:rPr>
-                <w:rtl w:val="0"/>
-              </w:rPr>
-            </w:r>
-          </w:p>
-        </w:tc>
-        <w:tc>
-          <w:tcPr/>
-          <w:p>
-            <w:pPr>
-              <w:rPr>
-                <w:rFonts w:ascii="Calibri" w:cs="Calibri" w:eastAsia="Calibri" w:hAnsi="Calibri"/>
-                <w:i w:val="1"/>
-                <w:iCs w:val="1"/>
-                <w:sz w:val="16"/>
-                <w:szCs w:val="16"/>
-              </w:rPr>
-            </w:pPr>
-            <w:r>
-              <w:rPr>
-                <w:i w:val="1"/>
-                <w:iCs w:val="1"/>
-                <w:sz w:val="16"/>
-                <w:szCs w:val="16"/>
-                <w:rtl w:val="0"/>
-              </w:rPr>
-              <w:t xml:space="preserve">Node.js, Vercel, Wireframes.</w:t>
-            </w:r>
-            <w:r>
-              <w:rPr>
-                <w:rtl w:val="0"/>
-              </w:rPr>
-            </w:r>
-          </w:p>
-        </w:tc>
-        <w:tc>
-          <w:tcPr/>
-          <w:p>
-            <w:pPr>
-              <w:rPr>
-                <w:rFonts w:ascii="Calibri" w:cs="Calibri" w:eastAsia="Calibri" w:hAnsi="Calibri"/>
-                <w:i w:val="1"/>
-                <w:iCs w:val="1"/>
-                <w:sz w:val="16"/>
-                <w:szCs w:val="16"/>
-              </w:rPr>
-            </w:pPr>
-            <w:r>
-              <w:rPr>
-                <w:i w:val="1"/>
-                <w:iCs w:val="1"/>
+              <w:t xml:space="preserve">Integración de Sistemas</w:t>
+            </w:r>
+          </w:p>
+        </w:tc>
+        <w:tc>
+          <w:tcPr/>
+          <w:p>
+            <w:pPr>
+              <w:rPr>
+                <w:rFonts w:ascii="Calibri" w:cs="Calibri" w:eastAsia="Calibri" w:hAnsi="Calibri"/>
+                <w:sz w:val="16"/>
+                <w:szCs w:val="16"/>
+              </w:rPr>
+            </w:pPr>
+            <w:r>
+              <w:rPr>
+                <w:sz w:val="16"/>
+                <w:szCs w:val="16"/>
+                <w:rtl w:val="0"/>
+              </w:rPr>
+              <w:t xml:space="preserve">Desarrollo de Procesos Asíncronos y QA</w:t>
+            </w:r>
+            <w:r>
+              <w:rPr>
+                <w:rtl w:val="0"/>
+              </w:rPr>
+            </w:r>
+          </w:p>
+        </w:tc>
+        <w:tc>
+          <w:tcPr/>
+          <w:p>
+            <w:pPr>
+              <w:rPr>
+                <w:rFonts w:ascii="Calibri" w:cs="Calibri" w:eastAsia="Calibri" w:hAnsi="Calibri"/>
+                <w:sz w:val="16"/>
+                <w:szCs w:val="16"/>
+              </w:rPr>
+            </w:pPr>
+            <w:r>
+              <w:rPr>
+                <w:sz w:val="16"/>
+                <w:szCs w:val="16"/>
+                <w:rtl w:val="0"/>
+              </w:rPr>
+              <w:t xml:space="preserve">Construcción de tareas en Celery, configuración de Redis y ejecución de pruebas de los endpoints en Postman.</w:t>
+            </w:r>
+            <w:r>
+              <w:rPr>
+                <w:rtl w:val="0"/>
+              </w:rPr>
+            </w:r>
+          </w:p>
+        </w:tc>
+        <w:tc>
+          <w:tcPr/>
+          <w:p>
+            <w:pPr>
+              <w:rPr>
+                <w:rFonts w:ascii="Calibri" w:cs="Calibri" w:eastAsia="Calibri" w:hAnsi="Calibri"/>
+                <w:sz w:val="16"/>
+                <w:szCs w:val="16"/>
+              </w:rPr>
+            </w:pPr>
+            <w:r>
+              <w:rPr>
+                <w:sz w:val="16"/>
+                <w:szCs w:val="16"/>
+                <w:rtl w:val="0"/>
+              </w:rPr>
+              <w:t xml:space="preserve">Python, Celery, Redis, Postman.</w:t>
+            </w:r>
+            <w:r>
+              <w:rPr>
+                <w:rtl w:val="0"/>
+              </w:rPr>
+            </w:r>
+          </w:p>
+        </w:tc>
+        <w:tc>
+          <w:tcPr/>
+          <w:p>
+            <w:pPr>
+              <w:rPr>
+                <w:rFonts w:ascii="Calibri" w:cs="Calibri" w:eastAsia="Calibri" w:hAnsi="Calibri"/>
+                <w:sz w:val="16"/>
+                <w:szCs w:val="16"/>
+              </w:rPr>
+            </w:pPr>
+            <w:r>
+              <w:rPr>
                 <w:sz w:val="16"/>
                 <w:szCs w:val="16"/>
                 <w:rtl w:val="0"/>
@@ -4987,16 +4970,12 @@
             <w:pPr>
               <w:rPr>
                 <w:rFonts w:ascii="Calibri" w:cs="Calibri" w:eastAsia="Calibri" w:hAnsi="Calibri"/>
-                <w:i w:val="1"/>
-                <w:iCs w:val="1"/>
-                <w:sz w:val="16"/>
-                <w:szCs w:val="16"/>
-              </w:rPr>
-            </w:pPr>
-            <w:r>
-              <w:rPr>
-                <w:i w:val="1"/>
-                <w:iCs w:val="1"/>
+                <w:sz w:val="16"/>
+                <w:szCs w:val="16"/>
+              </w:rPr>
+            </w:pPr>
+            <w:r>
+              <w:rPr>
                 <w:sz w:val="16"/>
                 <w:szCs w:val="16"/>
                 <w:rtl w:val="0"/>
@@ -5016,21 +4995,17 @@
             <w:pPr>
               <w:rPr>
                 <w:rFonts w:ascii="Calibri" w:cs="Calibri" w:eastAsia="Calibri" w:hAnsi="Calibri"/>
-                <w:i w:val="1"/>
-                <w:iCs w:val="1"/>
-                <w:sz w:val="16"/>
-                <w:szCs w:val="16"/>
-              </w:rPr>
-            </w:pPr>
-            <w:r>
-              <w:rPr>
-                <w:i w:val="1"/>
-                <w:iCs w:val="1"/>
-                <w:sz w:val="16"/>
-                <w:szCs w:val="16"/>
-                <w:rtl w:val="0"/>
-              </w:rPr>
-              <w:t xml:space="preserve">Facilitador: Uso de Vercel automatiza despliegues.</w:t>
+                <w:sz w:val="16"/>
+                <w:szCs w:val="16"/>
+              </w:rPr>
+            </w:pPr>
+            <w:r>
+              <w:rPr>
+                <w:sz w:val="16"/>
+                <w:szCs w:val="16"/>
+                <w:rtl w:val="0"/>
+              </w:rPr>
+              <w:t xml:space="preserve">Dificultad: Curva de aprendizaje técnica con la mensajería asíncrona de Celery.</w:t>
             </w:r>
             <w:r>
               <w:rPr>
@@ -5049,48 +5024,33 @@
           <w:tcPr/>
           <w:p>
             <w:pPr>
-              <w:jc w:val="both"/>
-              <w:rPr>
-                <w:rFonts w:ascii="Calibri" w:cs="Calibri" w:eastAsia="Calibri" w:hAnsi="Calibri"/>
-                <w:i w:val="1"/>
-                <w:iCs w:val="1"/>
+              <w:rPr>
                 <w:sz w:val="20"/>
                 <w:szCs w:val="20"/>
               </w:rPr>
             </w:pPr>
             <w:r>
               <w:rPr>
-                <w:i w:val="1"/>
-                <w:iCs w:val="1"/>
                 <w:sz w:val="20"/>
                 <w:szCs w:val="20"/>
                 <w:rtl w:val="0"/>
               </w:rPr>
               <w:t xml:space="preserve">Integración de Plataformas</w:t>
             </w:r>
-            <w:r>
-              <w:rPr>
-                <w:rtl w:val="0"/>
-              </w:rPr>
-            </w:r>
-          </w:p>
-        </w:tc>
-        <w:tc>
-          <w:tcPr/>
-          <w:p>
-            <w:pPr>
-              <w:rPr>
-                <w:rFonts w:ascii="Calibri" w:cs="Calibri" w:eastAsia="Calibri" w:hAnsi="Calibri"/>
-                <w:i w:val="1"/>
-                <w:iCs w:val="1"/>
-                <w:sz w:val="16"/>
-                <w:szCs w:val="16"/>
-              </w:rPr>
-            </w:pPr>
-            <w:r>
-              <w:rPr>
-                <w:i w:val="1"/>
-                <w:iCs w:val="1"/>
+          </w:p>
+        </w:tc>
+        <w:tc>
+          <w:tcPr/>
+          <w:p>
+            <w:pPr>
+              <w:rPr>
+                <w:rFonts w:ascii="Calibri" w:cs="Calibri" w:eastAsia="Calibri" w:hAnsi="Calibri"/>
+                <w:sz w:val="16"/>
+                <w:szCs w:val="16"/>
+              </w:rPr>
+            </w:pPr>
+            <w:r>
+              <w:rPr>
                 <w:sz w:val="16"/>
                 <w:szCs w:val="16"/>
                 <w:rtl w:val="0"/>
@@ -5110,74 +5070,94 @@
             <w:pPr>
               <w:rPr>
                 <w:rFonts w:ascii="Calibri" w:cs="Calibri" w:eastAsia="Calibri" w:hAnsi="Calibri"/>
-                <w:i w:val="1"/>
-                <w:iCs w:val="1"/>
-                <w:sz w:val="16"/>
-                <w:szCs w:val="16"/>
-              </w:rPr>
-            </w:pPr>
-            <w:r>
-              <w:rPr>
-                <w:i w:val="1"/>
-                <w:iCs w:val="1"/>
-                <w:sz w:val="16"/>
-                <w:szCs w:val="16"/>
-                <w:rtl w:val="0"/>
-              </w:rPr>
-              <w:t xml:space="preserve">Programación de la API (FastAPI) e integración del webhook de pagos (Transbank/Stripe).</w:t>
-            </w:r>
-            <w:r>
-              <w:rPr>
-                <w:rtl w:val="0"/>
-              </w:rPr>
-            </w:r>
-          </w:p>
-        </w:tc>
-        <w:tc>
-          <w:tcPr/>
-          <w:p>
-            <w:pPr>
-              <w:rPr>
-                <w:rFonts w:ascii="Calibri" w:cs="Calibri" w:eastAsia="Calibri" w:hAnsi="Calibri"/>
-                <w:i w:val="1"/>
-                <w:iCs w:val="1"/>
-                <w:sz w:val="16"/>
-                <w:szCs w:val="16"/>
-              </w:rPr>
-            </w:pPr>
-            <w:r>
-              <w:rPr>
-                <w:i w:val="1"/>
-                <w:iCs w:val="1"/>
-                <w:sz w:val="16"/>
-                <w:szCs w:val="16"/>
-                <w:rtl w:val="0"/>
-              </w:rPr>
-              <w:t xml:space="preserve">Python, FastAPI, Docs Pasarela.</w:t>
-            </w:r>
-            <w:r>
-              <w:rPr>
-                <w:rtl w:val="0"/>
-              </w:rPr>
-            </w:r>
-          </w:p>
-        </w:tc>
-        <w:tc>
-          <w:tcPr/>
-          <w:p>
-            <w:pPr>
-              <w:rPr>
-                <w:rFonts w:ascii="Calibri" w:cs="Calibri" w:eastAsia="Calibri" w:hAnsi="Calibri"/>
-                <w:i w:val="1"/>
-                <w:iCs w:val="1"/>
-                <w:sz w:val="16"/>
-                <w:szCs w:val="16"/>
-              </w:rPr>
-            </w:pPr>
-            <w:r>
-              <w:rPr>
-                <w:i w:val="1"/>
-                <w:iCs w:val="1"/>
+                <w:sz w:val="16"/>
+                <w:szCs w:val="16"/>
+              </w:rPr>
+            </w:pPr>
+            <w:r>
+              <w:rPr>
+                <w:sz w:val="16"/>
+                <w:szCs w:val="16"/>
+                <w:rtl w:val="0"/>
+              </w:rPr>
+              <w:t xml:space="preserve">Programación de la API (</w:t>
+            </w:r>
+            <w:r>
+              <w:rPr>
+                <w:sz w:val="16"/>
+                <w:szCs w:val="16"/>
+                <w:rtl w:val="0"/>
+              </w:rPr>
+              <w:t xml:space="preserve">FastAPI</w:t>
+            </w:r>
+            <w:r>
+              <w:rPr>
+                <w:sz w:val="16"/>
+                <w:szCs w:val="16"/>
+                <w:rtl w:val="0"/>
+              </w:rPr>
+              <w:t xml:space="preserve">) e integración del webhook de pagos (Transbank/Stripe).</w:t>
+            </w:r>
+            <w:r>
+              <w:rPr>
+                <w:rtl w:val="0"/>
+              </w:rPr>
+            </w:r>
+          </w:p>
+        </w:tc>
+        <w:tc>
+          <w:tcPr/>
+          <w:p>
+            <w:pPr>
+              <w:rPr>
+                <w:rFonts w:ascii="Calibri" w:cs="Calibri" w:eastAsia="Calibri" w:hAnsi="Calibri"/>
+                <w:sz w:val="16"/>
+                <w:szCs w:val="16"/>
+              </w:rPr>
+            </w:pPr>
+            <w:r>
+              <w:rPr>
+                <w:sz w:val="16"/>
+                <w:szCs w:val="16"/>
+                <w:rtl w:val="0"/>
+              </w:rPr>
+              <w:t xml:space="preserve">Python, </w:t>
+            </w:r>
+            <w:r>
+              <w:rPr>
+                <w:sz w:val="16"/>
+                <w:szCs w:val="16"/>
+                <w:rtl w:val="0"/>
+              </w:rPr>
+              <w:t xml:space="preserve">FastAPI</w:t>
+            </w:r>
+            <w:r>
+              <w:rPr>
+                <w:sz w:val="16"/>
+                <w:szCs w:val="16"/>
+                <w:rtl w:val="0"/>
+              </w:rPr>
+              <w:t xml:space="preserve">, Docs Pasarela.</w:t>
+            </w:r>
+            <w:r>
+              <w:rPr>
+                <w:rtl w:val="0"/>
+              </w:rPr>
+            </w:r>
+          </w:p>
+        </w:tc>
+        <w:tc>
+          <w:tcPr/>
+          <w:p>
+            <w:pPr>
+              <w:rPr>
+                <w:rFonts w:ascii="Calibri" w:cs="Calibri" w:eastAsia="Calibri" w:hAnsi="Calibri"/>
+                <w:sz w:val="16"/>
+                <w:szCs w:val="16"/>
+              </w:rPr>
+            </w:pPr>
+            <w:r>
+              <w:rPr>
                 <w:sz w:val="16"/>
                 <w:szCs w:val="16"/>
                 <w:rtl w:val="0"/>
@@ -5198,16 +5178,12 @@
           <w:p>
             <w:pPr>
               <w:rPr>
-                <w:i w:val="1"/>
-                <w:iCs w:val="1"/>
-                <w:sz w:val="16"/>
-                <w:szCs w:val="16"/>
-              </w:rPr>
-            </w:pPr>
-            <w:r>
-              <w:rPr>
-                <w:i w:val="1"/>
-                <w:iCs w:val="1"/>
+                <w:sz w:val="16"/>
+                <w:szCs w:val="16"/>
+              </w:rPr>
+            </w:pPr>
+            <w:r>
+              <w:rPr>
                 <w:sz w:val="16"/>
                 <w:szCs w:val="16"/>
                 <w:rtl w:val="0"/>
@@ -5218,50 +5194,42 @@
           <w:p>
             <w:pPr>
               <w:rPr>
-                <w:i w:val="1"/>
-                <w:iCs w:val="1"/>
-                <w:sz w:val="16"/>
-                <w:szCs w:val="16"/>
-              </w:rPr>
-            </w:pPr>
-            <w:r>
-              <w:rPr>
-                <w:rtl w:val="0"/>
-              </w:rPr>
-            </w:r>
-          </w:p>
-          <w:p>
-            <w:pPr>
-              <w:rPr>
-                <w:i w:val="1"/>
-                <w:iCs w:val="1"/>
-                <w:sz w:val="16"/>
-                <w:szCs w:val="16"/>
-              </w:rPr>
-            </w:pPr>
-            <w:r>
-              <w:rPr>
-                <w:rtl w:val="0"/>
-              </w:rPr>
-            </w:r>
-          </w:p>
-        </w:tc>
-        <w:tc>
-          <w:tcPr/>
-          <w:p>
-            <w:pPr>
-              <w:rPr>
-                <w:rFonts w:ascii="Calibri" w:cs="Calibri" w:eastAsia="Calibri" w:hAnsi="Calibri"/>
-                <w:i w:val="1"/>
-                <w:iCs w:val="1"/>
-                <w:sz w:val="16"/>
-                <w:szCs w:val="16"/>
-              </w:rPr>
-            </w:pPr>
-            <w:r>
-              <w:rPr>
-                <w:i w:val="1"/>
-                <w:iCs w:val="1"/>
+                <w:sz w:val="16"/>
+                <w:szCs w:val="16"/>
+              </w:rPr>
+            </w:pPr>
+            <w:r>
+              <w:rPr>
+                <w:rtl w:val="0"/>
+              </w:rPr>
+            </w:r>
+          </w:p>
+          <w:p>
+            <w:pPr>
+              <w:rPr>
+                <w:sz w:val="16"/>
+                <w:szCs w:val="16"/>
+              </w:rPr>
+            </w:pPr>
+            <w:r>
+              <w:rPr>
+                <w:rtl w:val="0"/>
+              </w:rPr>
+            </w:r>
+          </w:p>
+        </w:tc>
+        <w:tc>
+          <w:tcPr/>
+          <w:p>
+            <w:pPr>
+              <w:rPr>
+                <w:rFonts w:ascii="Calibri" w:cs="Calibri" w:eastAsia="Calibri" w:hAnsi="Calibri"/>
+                <w:sz w:val="16"/>
+                <w:szCs w:val="16"/>
+              </w:rPr>
+            </w:pPr>
+            <w:r>
+              <w:rPr>
                 <w:sz w:val="16"/>
                 <w:szCs w:val="16"/>
                 <w:rtl w:val="0"/>
@@ -5285,18 +5253,13 @@
           <w:tcPr/>
           <w:p>
             <w:pPr>
-              <w:jc w:val="both"/>
-              <w:rPr>
-                <w:i w:val="1"/>
-                <w:iCs w:val="1"/>
+              <w:rPr>
                 <w:sz w:val="20"/>
                 <w:szCs w:val="20"/>
               </w:rPr>
             </w:pPr>
             <w:r>
               <w:rPr>
-                <w:i w:val="1"/>
-                <w:iCs w:val="1"/>
                 <w:sz w:val="20"/>
                 <w:szCs w:val="20"/>
                 <w:rtl w:val="0"/>
@@ -5311,16 +5274,12 @@
             <w:pPr>
               <w:rPr>
                 <w:rFonts w:ascii="Calibri" w:cs="Calibri" w:eastAsia="Calibri" w:hAnsi="Calibri"/>
-                <w:i w:val="1"/>
-                <w:iCs w:val="1"/>
-                <w:sz w:val="16"/>
-                <w:szCs w:val="16"/>
-              </w:rPr>
-            </w:pPr>
-            <w:r>
-              <w:rPr>
-                <w:i w:val="1"/>
-                <w:iCs w:val="1"/>
+                <w:sz w:val="16"/>
+                <w:szCs w:val="16"/>
+              </w:rPr>
+            </w:pPr>
+            <w:r>
+              <w:rPr>
                 <w:sz w:val="16"/>
                 <w:szCs w:val="16"/>
                 <w:rtl w:val="0"/>
@@ -5340,16 +5299,12 @@
             <w:pPr>
               <w:rPr>
                 <w:rFonts w:ascii="Calibri" w:cs="Calibri" w:eastAsia="Calibri" w:hAnsi="Calibri"/>
-                <w:i w:val="1"/>
-                <w:iCs w:val="1"/>
-                <w:sz w:val="16"/>
-                <w:szCs w:val="16"/>
-              </w:rPr>
-            </w:pPr>
-            <w:r>
-              <w:rPr>
-                <w:i w:val="1"/>
-                <w:iCs w:val="1"/>
+                <w:sz w:val="16"/>
+                <w:szCs w:val="16"/>
+              </w:rPr>
+            </w:pPr>
+            <w:r>
+              <w:rPr>
                 <w:sz w:val="16"/>
                 <w:szCs w:val="16"/>
                 <w:rtl w:val="0"/>
@@ -5369,16 +5324,12 @@
             <w:pPr>
               <w:rPr>
                 <w:rFonts w:ascii="Calibri" w:cs="Calibri" w:eastAsia="Calibri" w:hAnsi="Calibri"/>
-                <w:i w:val="1"/>
-                <w:iCs w:val="1"/>
-                <w:sz w:val="16"/>
-                <w:szCs w:val="16"/>
-              </w:rPr>
-            </w:pPr>
-            <w:r>
-              <w:rPr>
-                <w:i w:val="1"/>
-                <w:iCs w:val="1"/>
+                <w:sz w:val="16"/>
+                <w:szCs w:val="16"/>
+              </w:rPr>
+            </w:pPr>
+            <w:r>
+              <w:rPr>
                 <w:sz w:val="16"/>
                 <w:szCs w:val="16"/>
                 <w:rtl w:val="0"/>
@@ -5398,16 +5349,12 @@
             <w:pPr>
               <w:rPr>
                 <w:rFonts w:ascii="Calibri" w:cs="Calibri" w:eastAsia="Calibri" w:hAnsi="Calibri"/>
-                <w:i w:val="1"/>
-                <w:iCs w:val="1"/>
-                <w:sz w:val="16"/>
-                <w:szCs w:val="16"/>
-              </w:rPr>
-            </w:pPr>
-            <w:r>
-              <w:rPr>
-                <w:i w:val="1"/>
-                <w:iCs w:val="1"/>
+                <w:sz w:val="16"/>
+                <w:szCs w:val="16"/>
+              </w:rPr>
+            </w:pPr>
+            <w:r>
+              <w:rPr>
                 <w:sz w:val="16"/>
                 <w:szCs w:val="16"/>
                 <w:rtl w:val="0"/>
@@ -5429,16 +5376,12 @@
             <w:pPr>
               <w:rPr>
                 <w:rFonts w:ascii="Calibri" w:cs="Calibri" w:eastAsia="Calibri" w:hAnsi="Calibri"/>
-                <w:i w:val="1"/>
-                <w:iCs w:val="1"/>
-                <w:sz w:val="16"/>
-                <w:szCs w:val="16"/>
-              </w:rPr>
-            </w:pPr>
-            <w:r>
-              <w:rPr>
-                <w:i w:val="1"/>
-                <w:iCs w:val="1"/>
+                <w:sz w:val="16"/>
+                <w:szCs w:val="16"/>
+              </w:rPr>
+            </w:pPr>
+            <w:r>
+              <w:rPr>
                 <w:sz w:val="16"/>
                 <w:szCs w:val="16"/>
                 <w:rtl w:val="0"/>
@@ -5458,16 +5401,12 @@
             <w:pPr>
               <w:rPr>
                 <w:rFonts w:ascii="Calibri" w:cs="Calibri" w:eastAsia="Calibri" w:hAnsi="Calibri"/>
-                <w:i w:val="1"/>
-                <w:iCs w:val="1"/>
-                <w:sz w:val="16"/>
-                <w:szCs w:val="16"/>
-              </w:rPr>
-            </w:pPr>
-            <w:r>
-              <w:rPr>
-                <w:i w:val="1"/>
-                <w:iCs w:val="1"/>
+                <w:sz w:val="16"/>
+                <w:szCs w:val="16"/>
+              </w:rPr>
+            </w:pPr>
+            <w:r>
+              <w:rPr>
                 <w:sz w:val="16"/>
                 <w:szCs w:val="16"/>
                 <w:rtl w:val="0"/>
@@ -5476,8 +5415,6 @@
             </w:r>
             <w:r>
               <w:rPr>
-                <w:i w:val="1"/>
-                <w:iCs w:val="1"/>
                 <w:sz w:val="16"/>
                 <w:szCs w:val="16"/>
                 <w:rtl w:val="0"/>
@@ -5486,8 +5423,6 @@
             </w:r>
             <w:r>
               <w:rPr>
-                <w:i w:val="1"/>
-                <w:iCs w:val="1"/>
                 <w:sz w:val="16"/>
                 <w:szCs w:val="16"/>
                 <w:rtl w:val="0"/>
@@ -5511,18 +5446,13 @@
           <w:tcPr/>
           <w:p>
             <w:pPr>
-              <w:jc w:val="both"/>
-              <w:rPr>
-                <w:i w:val="1"/>
-                <w:iCs w:val="1"/>
+              <w:rPr>
                 <w:sz w:val="20"/>
                 <w:szCs w:val="20"/>
               </w:rPr>
             </w:pPr>
             <w:r>
               <w:rPr>
-                <w:i w:val="1"/>
-                <w:iCs w:val="1"/>
                 <w:sz w:val="20"/>
                 <w:szCs w:val="20"/>
                 <w:rtl w:val="0"/>
@@ -5536,16 +5466,12 @@
           <w:p>
             <w:pPr>
               <w:rPr>
-                <w:i w:val="1"/>
-                <w:iCs w:val="1"/>
-                <w:sz w:val="16"/>
-                <w:szCs w:val="16"/>
-              </w:rPr>
-            </w:pPr>
-            <w:r>
-              <w:rPr>
-                <w:i w:val="1"/>
-                <w:iCs w:val="1"/>
+                <w:sz w:val="16"/>
+                <w:szCs w:val="16"/>
+              </w:rPr>
+            </w:pPr>
+            <w:r>
+              <w:rPr>
                 <w:sz w:val="16"/>
                 <w:szCs w:val="16"/>
                 <w:rtl w:val="0"/>
@@ -5559,16 +5485,12 @@
           <w:p>
             <w:pPr>
               <w:rPr>
-                <w:i w:val="1"/>
-                <w:iCs w:val="1"/>
-                <w:sz w:val="16"/>
-                <w:szCs w:val="16"/>
-              </w:rPr>
-            </w:pPr>
-            <w:r>
-              <w:rPr>
-                <w:i w:val="1"/>
-                <w:iCs w:val="1"/>
+                <w:sz w:val="16"/>
+                <w:szCs w:val="16"/>
+              </w:rPr>
+            </w:pPr>
+            <w:r>
+              <w:rPr>
                 <w:sz w:val="16"/>
                 <w:szCs w:val="16"/>
                 <w:rtl w:val="0"/>
@@ -5582,16 +5504,12 @@
           <w:p>
             <w:pPr>
               <w:rPr>
-                <w:i w:val="1"/>
-                <w:iCs w:val="1"/>
-                <w:sz w:val="16"/>
-                <w:szCs w:val="16"/>
-              </w:rPr>
-            </w:pPr>
-            <w:r>
-              <w:rPr>
-                <w:i w:val="1"/>
-                <w:iCs w:val="1"/>
+                <w:sz w:val="16"/>
+                <w:szCs w:val="16"/>
+              </w:rPr>
+            </w:pPr>
+            <w:r>
+              <w:rPr>
                 <w:sz w:val="16"/>
                 <w:szCs w:val="16"/>
                 <w:rtl w:val="0"/>
@@ -5605,16 +5523,12 @@
           <w:p>
             <w:pPr>
               <w:rPr>
-                <w:i w:val="1"/>
-                <w:iCs w:val="1"/>
-                <w:sz w:val="16"/>
-                <w:szCs w:val="16"/>
-              </w:rPr>
-            </w:pPr>
-            <w:r>
-              <w:rPr>
-                <w:i w:val="1"/>
-                <w:iCs w:val="1"/>
+                <w:sz w:val="16"/>
+                <w:szCs w:val="16"/>
+              </w:rPr>
+            </w:pPr>
+            <w:r>
+              <w:rPr>
                 <w:sz w:val="16"/>
                 <w:szCs w:val="16"/>
                 <w:rtl w:val="0"/>
@@ -5630,16 +5544,12 @@
           <w:p>
             <w:pPr>
               <w:rPr>
-                <w:i w:val="1"/>
-                <w:iCs w:val="1"/>
-                <w:sz w:val="16"/>
-                <w:szCs w:val="16"/>
-              </w:rPr>
-            </w:pPr>
-            <w:r>
-              <w:rPr>
-                <w:i w:val="1"/>
-                <w:iCs w:val="1"/>
+                <w:sz w:val="16"/>
+                <w:szCs w:val="16"/>
+              </w:rPr>
+            </w:pPr>
+            <w:r>
+              <w:rPr>
                 <w:sz w:val="16"/>
                 <w:szCs w:val="16"/>
                 <w:rtl w:val="0"/>
@@ -5653,16 +5563,12 @@
           <w:p>
             <w:pPr>
               <w:rPr>
-                <w:i w:val="1"/>
-                <w:iCs w:val="1"/>
-                <w:sz w:val="16"/>
-                <w:szCs w:val="16"/>
-              </w:rPr>
-            </w:pPr>
-            <w:r>
-              <w:rPr>
-                <w:i w:val="1"/>
-                <w:iCs w:val="1"/>
+                <w:sz w:val="16"/>
+                <w:szCs w:val="16"/>
+              </w:rPr>
+            </w:pPr>
+            <w:r>
+              <w:rPr>
                 <w:sz w:val="16"/>
                 <w:szCs w:val="16"/>
                 <w:rtl w:val="0"/>
@@ -5764,7 +5670,6 @@
             <w:pPr>
               <w:keepNext w:val="0"/>
               <w:keepLines w:val="0"/>
-              <w:pageBreakBefore w:val="0"/>
               <w:widowControl w:val="1"/>
               <w:pBdr>
                 <w:top w:space="0" w:sz="0" w:val="nil"/>
@@ -6559,18 +6464,27 @@
               </w:rPr>
               <w:t xml:space="preserve">1. Planificación y Levantamiento</w:t>
             </w:r>
-            <w:r>
-              <w:rPr>
-                <w:rtl w:val="0"/>
-              </w:rPr>
-            </w:r>
-          </w:p>
-        </w:tc>
-        <w:tc>
-          <w:tcPr/>
-          <w:p>
-            <w:pPr>
-              <w:spacing w:line="360" w:lineRule="auto"/>
+          </w:p>
+        </w:tc>
+        <w:tc>
+          <w:tcPr>
+            <w:shd w:fill="00ff00" w:val="clear"/>
+          </w:tcPr>
+          <w:p>
+            <w:pPr>
+              <w:keepNext w:val="0"/>
+              <w:keepLines w:val="0"/>
+              <w:widowControl w:val="1"/>
+              <w:pBdr>
+                <w:top w:space="0" w:sz="0" w:val="nil"/>
+                <w:left w:space="0" w:sz="0" w:val="nil"/>
+                <w:bottom w:space="0" w:sz="0" w:val="nil"/>
+                <w:right w:space="0" w:sz="0" w:val="nil"/>
+                <w:between w:space="0" w:sz="0" w:val="nil"/>
+              </w:pBdr>
+              <w:shd w:fill="auto" w:val="clear"/>
+              <w:spacing w:after="160" w:before="0" w:line="360" w:lineRule="auto"/>
+              <w:ind w:left="0" w:right="0" w:firstLine="0"/>
               <w:jc w:val="center"/>
               <w:rPr>
                 <w:b w:val="1"/>
@@ -6592,7 +6506,9 @@
           </w:p>
         </w:tc>
         <w:tc>
-          <w:tcPr/>
+          <w:tcPr>
+            <w:shd w:fill="00ff00" w:val="clear"/>
+          </w:tcPr>
           <w:p>
             <w:pPr>
               <w:spacing w:line="360" w:lineRule="auto"/>
@@ -6617,7 +6533,9 @@
           </w:p>
         </w:tc>
         <w:tc>
-          <w:tcPr/>
+          <w:tcPr>
+            <w:shd w:fill="00ff00" w:val="clear"/>
+          </w:tcPr>
           <w:p>
             <w:pPr>
               <w:spacing w:line="360" w:lineRule="auto"/>
@@ -6642,7 +6560,9 @@
           </w:p>
         </w:tc>
         <w:tc>
-          <w:tcPr/>
+          <w:tcPr>
+            <w:shd w:fill="00ff00" w:val="clear"/>
+          </w:tcPr>
           <w:p>
             <w:pPr>
               <w:spacing w:line="360" w:lineRule="auto"/>
@@ -7060,7 +6980,9 @@
           </w:p>
         </w:tc>
         <w:tc>
-          <w:tcPr/>
+          <w:tcPr>
+            <w:shd w:fill="00ff00" w:val="clear"/>
+          </w:tcPr>
           <w:p>
             <w:pPr>
               <w:spacing w:line="360" w:lineRule="auto"/>
@@ -7085,7 +7007,9 @@
           </w:p>
         </w:tc>
         <w:tc>
-          <w:tcPr/>
+          <w:tcPr>
+            <w:shd w:fill="00ff00" w:val="clear"/>
+          </w:tcPr>
           <w:p>
             <w:pPr>
               <w:spacing w:line="360" w:lineRule="auto"/>
@@ -7110,7 +7034,9 @@
           </w:p>
         </w:tc>
         <w:tc>
-          <w:tcPr/>
+          <w:tcPr>
+            <w:shd w:fill="00ff00" w:val="clear"/>
+          </w:tcPr>
           <w:p>
             <w:pPr>
               <w:spacing w:line="360" w:lineRule="auto"/>
@@ -7383,112 +7309,114 @@
                 <w:szCs w:val="16"/>
                 <w:rtl w:val="0"/>
               </w:rPr>
-              <w:t xml:space="preserve">3. Desarrollo Frontend y Prototipado</w:t>
-            </w:r>
-          </w:p>
-        </w:tc>
-        <w:tc>
-          <w:tcPr/>
-          <w:p>
-            <w:pPr>
-              <w:spacing w:line="360" w:lineRule="auto"/>
-              <w:jc w:val="center"/>
-              <w:rPr>
-                <w:b w:val="1"/>
-                <w:bCs w:val="1"/>
-                <w:sz w:val="16"/>
-                <w:szCs w:val="16"/>
-              </w:rPr>
-            </w:pPr>
-            <w:r>
-              <w:rPr>
-                <w:rtl w:val="0"/>
-              </w:rPr>
-            </w:r>
-          </w:p>
-        </w:tc>
-        <w:tc>
-          <w:tcPr/>
-          <w:p>
-            <w:pPr>
-              <w:spacing w:line="360" w:lineRule="auto"/>
-              <w:jc w:val="center"/>
-              <w:rPr>
-                <w:b w:val="1"/>
-                <w:bCs w:val="1"/>
-                <w:sz w:val="16"/>
-                <w:szCs w:val="16"/>
-              </w:rPr>
-            </w:pPr>
-            <w:r>
-              <w:rPr>
-                <w:rtl w:val="0"/>
-              </w:rPr>
-            </w:r>
-          </w:p>
-        </w:tc>
-        <w:tc>
-          <w:tcPr/>
-          <w:p>
-            <w:pPr>
-              <w:spacing w:line="360" w:lineRule="auto"/>
-              <w:jc w:val="center"/>
-              <w:rPr>
-                <w:b w:val="1"/>
-                <w:bCs w:val="1"/>
-                <w:sz w:val="16"/>
-                <w:szCs w:val="16"/>
-              </w:rPr>
-            </w:pPr>
-            <w:r>
-              <w:rPr>
-                <w:rtl w:val="0"/>
-              </w:rPr>
-            </w:r>
-          </w:p>
-        </w:tc>
-        <w:tc>
-          <w:tcPr/>
-          <w:p>
-            <w:pPr>
-              <w:spacing w:line="360" w:lineRule="auto"/>
-              <w:jc w:val="center"/>
-              <w:rPr>
-                <w:b w:val="1"/>
-                <w:bCs w:val="1"/>
-                <w:sz w:val="16"/>
-                <w:szCs w:val="16"/>
-              </w:rPr>
-            </w:pPr>
-            <w:r>
-              <w:rPr>
-                <w:rtl w:val="0"/>
-              </w:rPr>
-            </w:r>
-          </w:p>
-        </w:tc>
-        <w:tc>
-          <w:tcPr/>
-          <w:p>
-            <w:pPr>
-              <w:spacing w:line="360" w:lineRule="auto"/>
-              <w:jc w:val="center"/>
-              <w:rPr>
-                <w:b w:val="1"/>
-                <w:bCs w:val="1"/>
-                <w:sz w:val="16"/>
-                <w:szCs w:val="16"/>
-              </w:rPr>
-            </w:pPr>
-            <w:r>
-              <w:rPr>
-                <w:rtl w:val="0"/>
-              </w:rPr>
-            </w:r>
-          </w:p>
-        </w:tc>
-        <w:tc>
-          <w:tcPr/>
+              <w:t xml:space="preserve">3. Desarrollo de Procesos Asíncronos y QA</w:t>
+            </w:r>
+          </w:p>
+        </w:tc>
+        <w:tc>
+          <w:tcPr/>
+          <w:p>
+            <w:pPr>
+              <w:spacing w:line="360" w:lineRule="auto"/>
+              <w:jc w:val="center"/>
+              <w:rPr>
+                <w:b w:val="1"/>
+                <w:bCs w:val="1"/>
+                <w:sz w:val="16"/>
+                <w:szCs w:val="16"/>
+              </w:rPr>
+            </w:pPr>
+            <w:r>
+              <w:rPr>
+                <w:rtl w:val="0"/>
+              </w:rPr>
+            </w:r>
+          </w:p>
+        </w:tc>
+        <w:tc>
+          <w:tcPr/>
+          <w:p>
+            <w:pPr>
+              <w:spacing w:line="360" w:lineRule="auto"/>
+              <w:jc w:val="center"/>
+              <w:rPr>
+                <w:b w:val="1"/>
+                <w:bCs w:val="1"/>
+                <w:sz w:val="16"/>
+                <w:szCs w:val="16"/>
+              </w:rPr>
+            </w:pPr>
+            <w:r>
+              <w:rPr>
+                <w:rtl w:val="0"/>
+              </w:rPr>
+            </w:r>
+          </w:p>
+        </w:tc>
+        <w:tc>
+          <w:tcPr/>
+          <w:p>
+            <w:pPr>
+              <w:spacing w:line="360" w:lineRule="auto"/>
+              <w:jc w:val="center"/>
+              <w:rPr>
+                <w:b w:val="1"/>
+                <w:bCs w:val="1"/>
+                <w:sz w:val="16"/>
+                <w:szCs w:val="16"/>
+              </w:rPr>
+            </w:pPr>
+            <w:r>
+              <w:rPr>
+                <w:rtl w:val="0"/>
+              </w:rPr>
+            </w:r>
+          </w:p>
+        </w:tc>
+        <w:tc>
+          <w:tcPr/>
+          <w:p>
+            <w:pPr>
+              <w:spacing w:line="360" w:lineRule="auto"/>
+              <w:jc w:val="center"/>
+              <w:rPr>
+                <w:b w:val="1"/>
+                <w:bCs w:val="1"/>
+                <w:sz w:val="16"/>
+                <w:szCs w:val="16"/>
+              </w:rPr>
+            </w:pPr>
+            <w:r>
+              <w:rPr>
+                <w:rtl w:val="0"/>
+              </w:rPr>
+            </w:r>
+          </w:p>
+        </w:tc>
+        <w:tc>
+          <w:tcPr/>
+          <w:p>
+            <w:pPr>
+              <w:spacing w:line="360" w:lineRule="auto"/>
+              <w:jc w:val="center"/>
+              <w:rPr>
+                <w:b w:val="1"/>
+                <w:bCs w:val="1"/>
+                <w:sz w:val="16"/>
+                <w:szCs w:val="16"/>
+              </w:rPr>
+            </w:pPr>
+            <w:r>
+              <w:rPr>
+                <w:rtl w:val="0"/>
+              </w:rPr>
+            </w:r>
+          </w:p>
+        </w:tc>
+        <w:tc>
+          <w:tcPr>
+            <w:shd w:fill="00ff00" w:val="clear"/>
+          </w:tcPr>
           <w:p>
             <w:pPr>
               <w:spacing w:line="360" w:lineRule="auto"/>
@@ -7513,7 +7441,9 @@
           </w:p>
         </w:tc>
         <w:tc>
-          <w:tcPr/>
+          <w:tcPr>
+            <w:shd w:fill="00ff00" w:val="clear"/>
+          </w:tcPr>
           <w:p>
             <w:pPr>
               <w:spacing w:line="360" w:lineRule="auto"/>
@@ -7538,7 +7468,9 @@
           </w:p>
         </w:tc>
         <w:tc>
-          <w:tcPr/>
+          <w:tcPr>
+            <w:shd w:fill="00ff00" w:val="clear"/>
+          </w:tcPr>
           <w:p>
             <w:pPr>
               <w:spacing w:line="360" w:lineRule="auto"/>
@@ -7563,7 +7495,9 @@
           </w:p>
         </w:tc>
         <w:tc>
-          <w:tcPr/>
+          <w:tcPr>
+            <w:shd w:fill="00ff00" w:val="clear"/>
+          </w:tcPr>
           <w:p>
             <w:pPr>
               <w:spacing w:line="360" w:lineRule="auto"/>
@@ -7588,7 +7522,9 @@
           </w:p>
         </w:tc>
         <w:tc>
-          <w:tcPr/>
+          <w:tcPr>
+            <w:shd w:fill="00ff00" w:val="clear"/>
+          </w:tcPr>
           <w:p>
             <w:pPr>
               <w:spacing w:line="360" w:lineRule="auto"/>
@@ -7613,7 +7549,9 @@
           </w:p>
         </w:tc>
         <w:tc>
-          <w:tcPr/>
+          <w:tcPr>
+            <w:shd w:fill="00ff00" w:val="clear"/>
+          </w:tcPr>
           <w:p>
             <w:pPr>
               <w:spacing w:line="360" w:lineRule="auto"/>
@@ -7638,7 +7576,9 @@
           </w:p>
         </w:tc>
         <w:tc>
-          <w:tcPr/>
+          <w:tcPr>
+            <w:shd w:fill="00ff00" w:val="clear"/>
+          </w:tcPr>
           <w:p>
             <w:pPr>
               <w:spacing w:line="360" w:lineRule="auto"/>
@@ -7916,7 +7856,9 @@
           </w:p>
         </w:tc>
         <w:tc>
-          <w:tcPr/>
+          <w:tcPr>
+            <w:shd w:fill="00ff00" w:val="clear"/>
+          </w:tcPr>
           <w:p>
             <w:pPr>
               <w:spacing w:line="360" w:lineRule="auto"/>
@@ -7941,7 +7883,9 @@
           </w:p>
         </w:tc>
         <w:tc>
-          <w:tcPr/>
+          <w:tcPr>
+            <w:shd w:fill="00ff00" w:val="clear"/>
+          </w:tcPr>
           <w:p>
             <w:pPr>
               <w:spacing w:line="360" w:lineRule="auto"/>
@@ -7966,7 +7910,9 @@
           </w:p>
         </w:tc>
         <w:tc>
-          <w:tcPr/>
+          <w:tcPr>
+            <w:shd w:fill="00ff00" w:val="clear"/>
+          </w:tcPr>
           <w:p>
             <w:pPr>
               <w:spacing w:line="360" w:lineRule="auto"/>
@@ -7991,7 +7937,9 @@
           </w:p>
         </w:tc>
         <w:tc>
-          <w:tcPr/>
+          <w:tcPr>
+            <w:shd w:fill="00ff00" w:val="clear"/>
+          </w:tcPr>
           <w:p>
             <w:pPr>
               <w:spacing w:line="360" w:lineRule="auto"/>
@@ -8016,7 +7964,9 @@
           </w:p>
         </w:tc>
         <w:tc>
-          <w:tcPr/>
+          <w:tcPr>
+            <w:shd w:fill="00ff00" w:val="clear"/>
+          </w:tcPr>
           <w:p>
             <w:pPr>
               <w:spacing w:line="360" w:lineRule="auto"/>
@@ -8041,7 +7991,9 @@
           </w:p>
         </w:tc>
         <w:tc>
-          <w:tcPr/>
+          <w:tcPr>
+            <w:shd w:fill="00ff00" w:val="clear"/>
+          </w:tcPr>
           <w:p>
             <w:pPr>
               <w:spacing w:line="360" w:lineRule="auto"/>
@@ -8066,7 +8018,9 @@
           </w:p>
         </w:tc>
         <w:tc>
-          <w:tcPr/>
+          <w:tcPr>
+            <w:shd w:fill="00ff00" w:val="clear"/>
+          </w:tcPr>
           <w:p>
             <w:pPr>
               <w:spacing w:line="360" w:lineRule="auto"/>
@@ -8484,7 +8438,9 @@
           </w:p>
         </w:tc>
         <w:tc>
-          <w:tcPr/>
+          <w:tcPr>
+            <w:shd w:fill="00ff00" w:val="clear"/>
+          </w:tcPr>
           <w:p>
             <w:pPr>
               <w:spacing w:line="360" w:lineRule="auto"/>
@@ -8509,7 +8465,9 @@
           </w:p>
         </w:tc>
         <w:tc>
-          <w:tcPr/>
+          <w:tcPr>
+            <w:shd w:fill="00ff00" w:val="clear"/>
+          </w:tcPr>
           <w:p>
             <w:pPr>
               <w:spacing w:line="360" w:lineRule="auto"/>
@@ -8534,7 +8492,9 @@
           </w:p>
         </w:tc>
         <w:tc>
-          <w:tcPr/>
+          <w:tcPr>
+            <w:shd w:fill="00ff00" w:val="clear"/>
+          </w:tcPr>
           <w:p>
             <w:pPr>
               <w:spacing w:line="360" w:lineRule="auto"/>
@@ -8954,6 +8914,7 @@
         <w:tc>
           <w:tcPr>
             <w:gridSpan w:val="2"/>
+            <w:shd w:fill="00ff00" w:val="clear"/>
           </w:tcPr>
           <w:p>
             <w:pPr>
@@ -8979,7 +8940,9 @@
           </w:p>
         </w:tc>
         <w:tc>
-          <w:tcPr/>
+          <w:tcPr>
+            <w:shd w:fill="00ff00" w:val="clear"/>
+          </w:tcPr>
           <w:p>
             <w:pPr>
               <w:spacing w:line="360" w:lineRule="auto"/>
@@ -9004,7 +8967,9 @@
           </w:p>
         </w:tc>
         <w:tc>
-          <w:tcPr/>
+          <w:tcPr>
+            <w:shd w:fill="00ff00" w:val="clear"/>
+          </w:tcPr>
           <w:p>
             <w:pPr>
               <w:spacing w:line="360" w:lineRule="auto"/>
@@ -9057,7 +9022,6 @@
       <w:pPr>
         <w:keepNext w:val="0"/>
         <w:keepLines w:val="0"/>
-        <w:pageBreakBefore w:val="0"/>
         <w:widowControl w:val="1"/>
         <w:pBdr>
           <w:top w:space="0" w:sz="0" w:val="nil"/>
@@ -9142,7 +9106,6 @@
     <w:pPr>
       <w:keepNext w:val="0"/>
       <w:keepLines w:val="0"/>
-      <w:pageBreakBefore w:val="0"/>
       <w:widowControl w:val="0"/>
       <w:pBdr>
         <w:top w:space="0" w:sz="0" w:val="nil"/>
@@ -9296,7 +9259,7 @@
               <wp:inline distB="0" distT="0" distL="0" distR="0">
                 <wp:extent cx="1996440" cy="428625"/>
                 <wp:effectExtent b="0" l="0" r="0" t="0"/>
-                <wp:docPr descr="http://www.duoc.cl/normasgraficas/normasgraficas/marca-duoc/6logo-fondo-transparente/fondo-transparente.png" id="49" name="image1.png"/>
+                <wp:docPr descr="http://www.duoc.cl/normasgraficas/normasgraficas/marca-duoc/6logo-fondo-transparente/fondo-transparente.png" id="51" name="image1.png"/>
                 <a:graphic>
                   <a:graphicData uri="http://schemas.openxmlformats.org/drawingml/2006/picture">
                     <pic:pic>
@@ -9338,7 +9301,6 @@
     <w:pPr>
       <w:keepNext w:val="0"/>
       <w:keepLines w:val="0"/>
-      <w:pageBreakBefore w:val="0"/>
       <w:widowControl w:val="1"/>
       <w:pBdr>
         <w:top w:space="0" w:sz="0" w:val="nil"/>
@@ -9495,100 +9457,6 @@
   <w:abstractNum w:abstractNumId="2">
     <w:lvl w:ilvl="0">
       <w:start w:val="1"/>
-      <w:numFmt w:val="upperLetter"/>
-      <w:lvlText w:val="%1."/>
-      <w:lvlJc w:val="left"/>
-      <w:pPr>
-        <w:ind w:left="720" w:hanging="360"/>
-      </w:pPr>
-      <w:rPr>
-        <w:rFonts w:ascii="Calibri" w:cs="Calibri" w:eastAsia="Calibri" w:hAnsi="Calibri"/>
-      </w:rPr>
-    </w:lvl>
-    <w:lvl w:ilvl="1">
-      <w:start w:val="1"/>
-      <w:numFmt w:val="lowerLetter"/>
-      <w:lvlText w:val="%2."/>
-      <w:lvlJc w:val="left"/>
-      <w:pPr>
-        <w:ind w:left="1440" w:hanging="360"/>
-      </w:pPr>
-      <w:rPr/>
-    </w:lvl>
-    <w:lvl w:ilvl="2">
-      <w:start w:val="1"/>
-      <w:numFmt w:val="lowerRoman"/>
-      <w:lvlText w:val="%3."/>
-      <w:lvlJc w:val="right"/>
-      <w:pPr>
-        <w:ind w:left="2160" w:hanging="180"/>
-      </w:pPr>
-      <w:rPr/>
-    </w:lvl>
-    <w:lvl w:ilvl="3">
-      <w:start w:val="1"/>
-      <w:numFmt w:val="decimal"/>
-      <w:lvlText w:val="%4."/>
-      <w:lvlJc w:val="left"/>
-      <w:pPr>
-        <w:ind w:left="2880" w:hanging="360"/>
-      </w:pPr>
-      <w:rPr/>
-    </w:lvl>
-    <w:lvl w:ilvl="4">
-      <w:start w:val="1"/>
-      <w:numFmt w:val="lowerLetter"/>
-      <w:lvlText w:val="%5."/>
-      <w:lvlJc w:val="left"/>
-      <w:pPr>
-        <w:ind w:left="3600" w:hanging="360"/>
-      </w:pPr>
-      <w:rPr/>
-    </w:lvl>
-    <w:lvl w:ilvl="5">
-      <w:start w:val="1"/>
-      <w:numFmt w:val="lowerRoman"/>
-      <w:lvlText w:val="%6."/>
-      <w:lvlJc w:val="right"/>
-      <w:pPr>
-        <w:ind w:left="4320" w:hanging="180"/>
-      </w:pPr>
-      <w:rPr/>
-    </w:lvl>
-    <w:lvl w:ilvl="6">
-      <w:start w:val="1"/>
-      <w:numFmt w:val="decimal"/>
-      <w:lvlText w:val="%7."/>
-      <w:lvlJc w:val="left"/>
-      <w:pPr>
-        <w:ind w:left="5040" w:hanging="360"/>
-      </w:pPr>
-      <w:rPr/>
-    </w:lvl>
-    <w:lvl w:ilvl="7">
-      <w:start w:val="1"/>
-      <w:numFmt w:val="lowerLetter"/>
-      <w:lvlText w:val="%8."/>
-      <w:lvlJc w:val="left"/>
-      <w:pPr>
-        <w:ind w:left="5760" w:hanging="360"/>
-      </w:pPr>
-      <w:rPr/>
-    </w:lvl>
-    <w:lvl w:ilvl="8">
-      <w:start w:val="1"/>
-      <w:numFmt w:val="lowerRoman"/>
-      <w:lvlText w:val="%9."/>
-      <w:lvlJc w:val="right"/>
-      <w:pPr>
-        <w:ind w:left="6480" w:hanging="180"/>
-      </w:pPr>
-      <w:rPr/>
-    </w:lvl>
-  </w:abstractNum>
-  <w:abstractNum w:abstractNumId="3">
-    <w:lvl w:ilvl="0">
-      <w:start w:val="1"/>
       <w:numFmt w:val="bullet"/>
       <w:lvlText w:val="●"/>
       <w:lvlJc w:val="left"/>
@@ -9694,6 +9562,100 @@
       <w:rPr>
         <w:u w:val="none"/>
       </w:rPr>
+    </w:lvl>
+  </w:abstractNum>
+  <w:abstractNum w:abstractNumId="3">
+    <w:lvl w:ilvl="0">
+      <w:start w:val="1"/>
+      <w:numFmt w:val="upperLetter"/>
+      <w:lvlText w:val="%1."/>
+      <w:lvlJc w:val="left"/>
+      <w:pPr>
+        <w:ind w:left="720" w:hanging="360"/>
+      </w:pPr>
+      <w:rPr>
+        <w:rFonts w:ascii="Calibri" w:cs="Calibri" w:eastAsia="Calibri" w:hAnsi="Calibri"/>
+      </w:rPr>
+    </w:lvl>
+    <w:lvl w:ilvl="1">
+      <w:start w:val="1"/>
+      <w:numFmt w:val="lowerLetter"/>
+      <w:lvlText w:val="%2."/>
+      <w:lvlJc w:val="left"/>
+      <w:pPr>
+        <w:ind w:left="1440" w:hanging="360"/>
+      </w:pPr>
+      <w:rPr/>
+    </w:lvl>
+    <w:lvl w:ilvl="2">
+      <w:start w:val="1"/>
+      <w:numFmt w:val="lowerRoman"/>
+      <w:lvlText w:val="%3."/>
+      <w:lvlJc w:val="right"/>
+      <w:pPr>
+        <w:ind w:left="2160" w:hanging="180"/>
+      </w:pPr>
+      <w:rPr/>
+    </w:lvl>
+    <w:lvl w:ilvl="3">
+      <w:start w:val="1"/>
+      <w:numFmt w:val="decimal"/>
+      <w:lvlText w:val="%4."/>
+      <w:lvlJc w:val="left"/>
+      <w:pPr>
+        <w:ind w:left="2880" w:hanging="360"/>
+      </w:pPr>
+      <w:rPr/>
+    </w:lvl>
+    <w:lvl w:ilvl="4">
+      <w:start w:val="1"/>
+      <w:numFmt w:val="lowerLetter"/>
+      <w:lvlText w:val="%5."/>
+      <w:lvlJc w:val="left"/>
+      <w:pPr>
+        <w:ind w:left="3600" w:hanging="360"/>
+      </w:pPr>
+      <w:rPr/>
+    </w:lvl>
+    <w:lvl w:ilvl="5">
+      <w:start w:val="1"/>
+      <w:numFmt w:val="lowerRoman"/>
+      <w:lvlText w:val="%6."/>
+      <w:lvlJc w:val="right"/>
+      <w:pPr>
+        <w:ind w:left="4320" w:hanging="180"/>
+      </w:pPr>
+      <w:rPr/>
+    </w:lvl>
+    <w:lvl w:ilvl="6">
+      <w:start w:val="1"/>
+      <w:numFmt w:val="decimal"/>
+      <w:lvlText w:val="%7."/>
+      <w:lvlJc w:val="left"/>
+      <w:pPr>
+        <w:ind w:left="5040" w:hanging="360"/>
+      </w:pPr>
+      <w:rPr/>
+    </w:lvl>
+    <w:lvl w:ilvl="7">
+      <w:start w:val="1"/>
+      <w:numFmt w:val="lowerLetter"/>
+      <w:lvlText w:val="%8."/>
+      <w:lvlJc w:val="left"/>
+      <w:pPr>
+        <w:ind w:left="5760" w:hanging="360"/>
+      </w:pPr>
+      <w:rPr/>
+    </w:lvl>
+    <w:lvl w:ilvl="8">
+      <w:start w:val="1"/>
+      <w:numFmt w:val="lowerRoman"/>
+      <w:lvlText w:val="%9."/>
+      <w:lvlJc w:val="right"/>
+      <w:pPr>
+        <w:ind w:left="6480" w:hanging="180"/>
+      </w:pPr>
+      <w:rPr/>
     </w:lvl>
   </w:abstractNum>
   <w:num w:numId="1">
@@ -9856,6 +9818,20 @@
       <w:sz w:val="72"/>
       <w:szCs w:val="72"/>
     </w:rPr>
+  </w:style>
+  <w:style w:type="table" w:styleId="TableNormal" w:default="1">
+    <w:name w:val="TableNormal"/>
+    <w:tblPr>
+      <w:tblCellMar>
+        <w:top w:w="100.0" w:type="dxa"/>
+        <w:left w:w="100.0" w:type="dxa"/>
+        <w:bottom w:w="100.0" w:type="dxa"/>
+        <w:right w:w="100.0" w:type="dxa"/>
+      </w:tblCellMar>
+    </w:tblPr>
+  </w:style>
+  <w:style w:type="paragraph" w:styleId="Normal" w:default="1">
+    <w:name w:val="normal"/>
   </w:style>
   <w:style w:type="character" w:styleId="Fuentedeprrafopredeter" w:default="1">
     <w:name w:val="Default Paragraph Font"/>
@@ -10144,6 +10120,295 @@
       <w:sz w:val="20"/>
       <w:szCs w:val="20"/>
     </w:rPr>
+  </w:style>
+  <w:style w:type="table" w:styleId="Table1">
+    <w:basedOn w:val="TableNormal"/>
+    <w:rPr>
+      <w:sz w:val="22"/>
+      <w:szCs w:val="22"/>
+    </w:rPr>
+    <w:tblPr>
+      <w:tblStyleRowBandSize w:val="1"/>
+      <w:tblStyleColBandSize w:val="1"/>
+      <w:tblCellMar>
+        <w:top w:w="0.0" w:type="dxa"/>
+        <w:left w:w="108.0" w:type="dxa"/>
+        <w:bottom w:w="0.0" w:type="dxa"/>
+        <w:right w:w="108.0" w:type="dxa"/>
+      </w:tblCellMar>
+    </w:tblPr>
+  </w:style>
+  <w:style w:type="table" w:styleId="Table2">
+    <w:basedOn w:val="TableNormal"/>
+    <w:rPr>
+      <w:sz w:val="22"/>
+      <w:szCs w:val="22"/>
+    </w:rPr>
+    <w:tblPr>
+      <w:tblStyleRowBandSize w:val="1"/>
+      <w:tblStyleColBandSize w:val="1"/>
+      <w:tblCellMar>
+        <w:top w:w="0.0" w:type="dxa"/>
+        <w:left w:w="108.0" w:type="dxa"/>
+        <w:bottom w:w="0.0" w:type="dxa"/>
+        <w:right w:w="108.0" w:type="dxa"/>
+      </w:tblCellMar>
+    </w:tblPr>
+  </w:style>
+  <w:style w:type="table" w:styleId="Table3">
+    <w:basedOn w:val="TableNormal"/>
+    <w:rPr>
+      <w:sz w:val="22"/>
+      <w:szCs w:val="22"/>
+    </w:rPr>
+    <w:tblPr>
+      <w:tblStyleRowBandSize w:val="1"/>
+      <w:tblStyleColBandSize w:val="1"/>
+      <w:tblCellMar>
+        <w:top w:w="0.0" w:type="dxa"/>
+        <w:left w:w="108.0" w:type="dxa"/>
+        <w:bottom w:w="0.0" w:type="dxa"/>
+        <w:right w:w="108.0" w:type="dxa"/>
+      </w:tblCellMar>
+    </w:tblPr>
+  </w:style>
+  <w:style w:type="table" w:styleId="Table4">
+    <w:basedOn w:val="TableNormal"/>
+    <w:rPr>
+      <w:sz w:val="22"/>
+      <w:szCs w:val="22"/>
+    </w:rPr>
+    <w:tblPr>
+      <w:tblStyleRowBandSize w:val="1"/>
+      <w:tblStyleColBandSize w:val="1"/>
+      <w:tblCellMar>
+        <w:top w:w="0.0" w:type="dxa"/>
+        <w:left w:w="108.0" w:type="dxa"/>
+        <w:bottom w:w="0.0" w:type="dxa"/>
+        <w:right w:w="108.0" w:type="dxa"/>
+      </w:tblCellMar>
+    </w:tblPr>
+  </w:style>
+  <w:style w:type="table" w:styleId="Table5">
+    <w:basedOn w:val="TableNormal"/>
+    <w:rPr>
+      <w:sz w:val="22"/>
+      <w:szCs w:val="22"/>
+    </w:rPr>
+    <w:tblPr>
+      <w:tblStyleRowBandSize w:val="1"/>
+      <w:tblStyleColBandSize w:val="1"/>
+      <w:tblCellMar>
+        <w:top w:w="0.0" w:type="dxa"/>
+        <w:left w:w="108.0" w:type="dxa"/>
+        <w:bottom w:w="0.0" w:type="dxa"/>
+        <w:right w:w="108.0" w:type="dxa"/>
+      </w:tblCellMar>
+    </w:tblPr>
+  </w:style>
+  <w:style w:type="table" w:styleId="Table6">
+    <w:basedOn w:val="TableNormal"/>
+    <w:rPr>
+      <w:sz w:val="22"/>
+      <w:szCs w:val="22"/>
+    </w:rPr>
+    <w:tblPr>
+      <w:tblStyleRowBandSize w:val="1"/>
+      <w:tblStyleColBandSize w:val="1"/>
+      <w:tblCellMar>
+        <w:top w:w="0.0" w:type="dxa"/>
+        <w:left w:w="108.0" w:type="dxa"/>
+        <w:bottom w:w="0.0" w:type="dxa"/>
+        <w:right w:w="108.0" w:type="dxa"/>
+      </w:tblCellMar>
+    </w:tblPr>
+  </w:style>
+  <w:style w:type="table" w:styleId="Table7">
+    <w:basedOn w:val="TableNormal"/>
+    <w:rPr>
+      <w:sz w:val="22"/>
+      <w:szCs w:val="22"/>
+    </w:rPr>
+    <w:tblPr>
+      <w:tblStyleRowBandSize w:val="1"/>
+      <w:tblStyleColBandSize w:val="1"/>
+      <w:tblCellMar>
+        <w:top w:w="0.0" w:type="dxa"/>
+        <w:left w:w="108.0" w:type="dxa"/>
+        <w:bottom w:w="0.0" w:type="dxa"/>
+        <w:right w:w="108.0" w:type="dxa"/>
+      </w:tblCellMar>
+    </w:tblPr>
+  </w:style>
+  <w:style w:type="table" w:styleId="Table8">
+    <w:basedOn w:val="TableNormal"/>
+    <w:rPr>
+      <w:sz w:val="22"/>
+      <w:szCs w:val="22"/>
+    </w:rPr>
+    <w:tblPr>
+      <w:tblStyleRowBandSize w:val="1"/>
+      <w:tblStyleColBandSize w:val="1"/>
+      <w:tblCellMar>
+        <w:top w:w="0.0" w:type="dxa"/>
+        <w:left w:w="108.0" w:type="dxa"/>
+        <w:bottom w:w="0.0" w:type="dxa"/>
+        <w:right w:w="108.0" w:type="dxa"/>
+      </w:tblCellMar>
+    </w:tblPr>
+  </w:style>
+  <w:style w:type="table" w:styleId="Table9">
+    <w:basedOn w:val="TableNormal"/>
+    <w:rPr>
+      <w:sz w:val="22"/>
+      <w:szCs w:val="22"/>
+    </w:rPr>
+    <w:tblPr>
+      <w:tblStyleRowBandSize w:val="1"/>
+      <w:tblStyleColBandSize w:val="1"/>
+      <w:tblCellMar>
+        <w:top w:w="0.0" w:type="dxa"/>
+        <w:left w:w="108.0" w:type="dxa"/>
+        <w:bottom w:w="0.0" w:type="dxa"/>
+        <w:right w:w="108.0" w:type="dxa"/>
+      </w:tblCellMar>
+    </w:tblPr>
+  </w:style>
+  <w:style w:type="table" w:styleId="Table10">
+    <w:basedOn w:val="TableNormal"/>
+    <w:rPr>
+      <w:sz w:val="22"/>
+      <w:szCs w:val="22"/>
+    </w:rPr>
+    <w:tblPr>
+      <w:tblStyleRowBandSize w:val="1"/>
+      <w:tblStyleColBandSize w:val="1"/>
+      <w:tblCellMar>
+        <w:top w:w="0.0" w:type="dxa"/>
+        <w:left w:w="108.0" w:type="dxa"/>
+        <w:bottom w:w="0.0" w:type="dxa"/>
+        <w:right w:w="108.0" w:type="dxa"/>
+      </w:tblCellMar>
+    </w:tblPr>
+  </w:style>
+  <w:style w:type="table" w:styleId="Table11">
+    <w:basedOn w:val="TableNormal"/>
+    <w:rPr>
+      <w:sz w:val="22"/>
+      <w:szCs w:val="22"/>
+    </w:rPr>
+    <w:tblPr>
+      <w:tblStyleRowBandSize w:val="1"/>
+      <w:tblStyleColBandSize w:val="1"/>
+      <w:tblCellMar>
+        <w:top w:w="0.0" w:type="dxa"/>
+        <w:left w:w="108.0" w:type="dxa"/>
+        <w:bottom w:w="0.0" w:type="dxa"/>
+        <w:right w:w="108.0" w:type="dxa"/>
+      </w:tblCellMar>
+    </w:tblPr>
+  </w:style>
+  <w:style w:type="table" w:styleId="Table12">
+    <w:basedOn w:val="TableNormal"/>
+    <w:rPr>
+      <w:sz w:val="22"/>
+      <w:szCs w:val="22"/>
+    </w:rPr>
+    <w:tblPr>
+      <w:tblStyleRowBandSize w:val="1"/>
+      <w:tblStyleColBandSize w:val="1"/>
+      <w:tblCellMar>
+        <w:top w:w="0.0" w:type="dxa"/>
+        <w:left w:w="108.0" w:type="dxa"/>
+        <w:bottom w:w="0.0" w:type="dxa"/>
+        <w:right w:w="108.0" w:type="dxa"/>
+      </w:tblCellMar>
+    </w:tblPr>
+  </w:style>
+  <w:style w:type="table" w:styleId="Table13">
+    <w:basedOn w:val="TableNormal"/>
+    <w:rPr>
+      <w:sz w:val="22"/>
+      <w:szCs w:val="22"/>
+    </w:rPr>
+    <w:tblPr>
+      <w:tblStyleRowBandSize w:val="1"/>
+      <w:tblStyleColBandSize w:val="1"/>
+      <w:tblCellMar>
+        <w:top w:w="0.0" w:type="dxa"/>
+        <w:left w:w="108.0" w:type="dxa"/>
+        <w:bottom w:w="0.0" w:type="dxa"/>
+        <w:right w:w="108.0" w:type="dxa"/>
+      </w:tblCellMar>
+    </w:tblPr>
+  </w:style>
+  <w:style w:type="table" w:styleId="Table14">
+    <w:basedOn w:val="TableNormal"/>
+    <w:rPr>
+      <w:sz w:val="22"/>
+      <w:szCs w:val="22"/>
+    </w:rPr>
+    <w:tblPr>
+      <w:tblStyleRowBandSize w:val="1"/>
+      <w:tblStyleColBandSize w:val="1"/>
+      <w:tblCellMar>
+        <w:top w:w="0.0" w:type="dxa"/>
+        <w:left w:w="108.0" w:type="dxa"/>
+        <w:bottom w:w="0.0" w:type="dxa"/>
+        <w:right w:w="108.0" w:type="dxa"/>
+      </w:tblCellMar>
+    </w:tblPr>
+  </w:style>
+  <w:style w:type="table" w:styleId="Table15">
+    <w:basedOn w:val="TableNormal"/>
+    <w:rPr>
+      <w:sz w:val="22"/>
+      <w:szCs w:val="22"/>
+    </w:rPr>
+    <w:tblPr>
+      <w:tblStyleRowBandSize w:val="1"/>
+      <w:tblStyleColBandSize w:val="1"/>
+      <w:tblCellMar>
+        <w:top w:w="0.0" w:type="dxa"/>
+        <w:left w:w="108.0" w:type="dxa"/>
+        <w:bottom w:w="0.0" w:type="dxa"/>
+        <w:right w:w="108.0" w:type="dxa"/>
+      </w:tblCellMar>
+    </w:tblPr>
+  </w:style>
+  <w:style w:type="table" w:styleId="Table16">
+    <w:basedOn w:val="TableNormal"/>
+    <w:rPr>
+      <w:sz w:val="22"/>
+      <w:szCs w:val="22"/>
+    </w:rPr>
+    <w:tblPr>
+      <w:tblStyleRowBandSize w:val="1"/>
+      <w:tblStyleColBandSize w:val="1"/>
+      <w:tblCellMar>
+        <w:top w:w="0.0" w:type="dxa"/>
+        <w:left w:w="108.0" w:type="dxa"/>
+        <w:bottom w:w="0.0" w:type="dxa"/>
+        <w:right w:w="108.0" w:type="dxa"/>
+      </w:tblCellMar>
+    </w:tblPr>
+  </w:style>
+  <w:style w:type="table" w:styleId="Table17">
+    <w:basedOn w:val="TableNormal"/>
+    <w:rPr>
+      <w:sz w:val="22"/>
+      <w:szCs w:val="22"/>
+    </w:rPr>
+    <w:tblPr>
+      <w:tblStyleRowBandSize w:val="1"/>
+      <w:tblStyleColBandSize w:val="1"/>
+      <w:tblCellMar>
+        <w:top w:w="0.0" w:type="dxa"/>
+        <w:left w:w="108.0" w:type="dxa"/>
+        <w:bottom w:w="0.0" w:type="dxa"/>
+        <w:right w:w="108.0" w:type="dxa"/>
+      </w:tblCellMar>
+    </w:tblPr>
   </w:style>
   <w:style w:type="paragraph" w:styleId="Subtitle">
     <w:name w:val="Subtitle"/>
@@ -10753,7 +11018,7 @@
 
 <file path=customXML/item1.xml><?xml version="1.0" encoding="utf-8"?>
 <go:gDocsCustomXmlDataStorage xmlns:go="http://customooxmlschemas.google.com/" xmlns:r="http://schemas.openxmlformats.org/officeDocument/2006/relationships" uri="GoogleDocsCustomDataVersion2">
-  <go:docsCustomData xmlns:go="http://customooxmlschemas.google.com/" roundtripDataSignature="AMtx7mg6nq7ugD+XzrymnUceHe3oCWitUA==">CgMxLjA4AHIhMXY5UkZNaFpiSEZzUnlzYXZSTGtXRkNHTm1QQUwzVUZZ</go:docsCustomData>
+  <go:docsCustomData xmlns:go="http://customooxmlschemas.google.com/" roundtripDataSignature="AMtx7mj6gQ6SWVRNPp0o+QTfSXcgJ8X/jA==">CgMxLjA4AHIhMTNJVm5PVkFMcjlkMXcyZU10WVF6eUlubXd0aEtpLW1I</go:docsCustomData>
 </go:gDocsCustomXmlDataStorage>
 </file>
 

</xml_diff>